<commit_message>
Informe: anexo con la bitácora de Facundo completa
Co-Authored-By: Claude Opus 5.5 <noreply@anthropic.com>
</commit_message>
<xml_diff>
--- a/docs/informe/Informe TIF AE4 - AgroLab.docx
+++ b/docs/informe/Informe TIF AE4 - AgroLab.docx
@@ -74,7 +74,7 @@
       <w:pPr>
         <w:pStyle w:val="Ttulo1"/>
       </w:pPr>
-      <w:bookmarkStart w:id="0" w:name="_Toc243510543"/>
+      <w:bookmarkStart w:id="0" w:name="_Toc243510645"/>
       <w:r>
         <w:lastRenderedPageBreak/>
         <w:t>Resumen</w:t>
@@ -168,7 +168,7 @@
       <w:r>
         <w:fldChar w:fldCharType="separate"/>
       </w:r>
-      <w:hyperlink w:anchor="_Toc243510543" w:history="1">
+      <w:hyperlink w:anchor="_Toc243510645" w:history="1">
         <w:r>
           <w:rPr>
             <w:rStyle w:val="Hipervnculo"/>
@@ -196,7 +196,7 @@
             <w:noProof/>
             <w:webHidden/>
           </w:rPr>
-          <w:instrText xml:space="preserve"> PAGEREF _Toc243510543 \h </w:instrText>
+          <w:instrText xml:space="preserve"> PAGEREF _Toc243510645 \h </w:instrText>
         </w:r>
         <w:r>
           <w:rPr>
@@ -242,7 +242,7 @@
           <w14:ligatures w14:val="standardContextual"/>
         </w:rPr>
       </w:pPr>
-      <w:hyperlink w:anchor="_Toc243510544" w:history="1">
+      <w:hyperlink w:anchor="_Toc243510646" w:history="1">
         <w:r>
           <w:rPr>
             <w:rStyle w:val="Hipervnculo"/>
@@ -270,7 +270,7 @@
             <w:noProof/>
             <w:webHidden/>
           </w:rPr>
-          <w:instrText xml:space="preserve"> PAGEREF _Toc243510544 \h </w:instrText>
+          <w:instrText xml:space="preserve"> PAGEREF _Toc243510646 \h </w:instrText>
         </w:r>
         <w:r>
           <w:rPr>
@@ -316,7 +316,7 @@
           <w14:ligatures w14:val="standardContextual"/>
         </w:rPr>
       </w:pPr>
-      <w:hyperlink w:anchor="_Toc243510545" w:history="1">
+      <w:hyperlink w:anchor="_Toc243510647" w:history="1">
         <w:r>
           <w:rPr>
             <w:rStyle w:val="Hipervnculo"/>
@@ -344,7 +344,7 @@
             <w:noProof/>
             <w:webHidden/>
           </w:rPr>
-          <w:instrText xml:space="preserve"> PAGEREF _Toc243510545 \h </w:instrText>
+          <w:instrText xml:space="preserve"> PAGEREF _Toc243510647 \h </w:instrText>
         </w:r>
         <w:r>
           <w:rPr>
@@ -390,7 +390,7 @@
           <w14:ligatures w14:val="standardContextual"/>
         </w:rPr>
       </w:pPr>
-      <w:hyperlink w:anchor="_Toc243510546" w:history="1">
+      <w:hyperlink w:anchor="_Toc243510648" w:history="1">
         <w:r>
           <w:rPr>
             <w:rStyle w:val="Hipervnculo"/>
@@ -418,7 +418,7 @@
             <w:noProof/>
             <w:webHidden/>
           </w:rPr>
-          <w:instrText xml:space="preserve"> PAGEREF _Toc243510546 \h </w:instrText>
+          <w:instrText xml:space="preserve"> PAGEREF _Toc243510648 \h </w:instrText>
         </w:r>
         <w:r>
           <w:rPr>
@@ -464,7 +464,7 @@
           <w14:ligatures w14:val="standardContextual"/>
         </w:rPr>
       </w:pPr>
-      <w:hyperlink w:anchor="_Toc243510547" w:history="1">
+      <w:hyperlink w:anchor="_Toc243510649" w:history="1">
         <w:r>
           <w:rPr>
             <w:rStyle w:val="Hipervnculo"/>
@@ -492,7 +492,7 @@
             <w:noProof/>
             <w:webHidden/>
           </w:rPr>
-          <w:instrText xml:space="preserve"> PAGEREF _Toc243510547 \h </w:instrText>
+          <w:instrText xml:space="preserve"> PAGEREF _Toc243510649 \h </w:instrText>
         </w:r>
         <w:r>
           <w:rPr>
@@ -538,7 +538,7 @@
           <w14:ligatures w14:val="standardContextual"/>
         </w:rPr>
       </w:pPr>
-      <w:hyperlink w:anchor="_Toc243510548" w:history="1">
+      <w:hyperlink w:anchor="_Toc243510650" w:history="1">
         <w:r>
           <w:rPr>
             <w:rStyle w:val="Hipervnculo"/>
@@ -566,7 +566,7 @@
             <w:noProof/>
             <w:webHidden/>
           </w:rPr>
-          <w:instrText xml:space="preserve"> PAGEREF _Toc243510548 \h </w:instrText>
+          <w:instrText xml:space="preserve"> PAGEREF _Toc243510650 \h </w:instrText>
         </w:r>
         <w:r>
           <w:rPr>
@@ -612,7 +612,7 @@
           <w14:ligatures w14:val="standardContextual"/>
         </w:rPr>
       </w:pPr>
-      <w:hyperlink w:anchor="_Toc243510549" w:history="1">
+      <w:hyperlink w:anchor="_Toc243510651" w:history="1">
         <w:r>
           <w:rPr>
             <w:rStyle w:val="Hipervnculo"/>
@@ -640,7 +640,7 @@
             <w:noProof/>
             <w:webHidden/>
           </w:rPr>
-          <w:instrText xml:space="preserve"> PAGEREF _Toc243510549 \h </w:instrText>
+          <w:instrText xml:space="preserve"> PAGEREF _Toc243510651 \h </w:instrText>
         </w:r>
         <w:r>
           <w:rPr>
@@ -686,7 +686,7 @@
           <w14:ligatures w14:val="standardContextual"/>
         </w:rPr>
       </w:pPr>
-      <w:hyperlink w:anchor="_Toc243510550" w:history="1">
+      <w:hyperlink w:anchor="_Toc243510652" w:history="1">
         <w:r>
           <w:rPr>
             <w:rStyle w:val="Hipervnculo"/>
@@ -714,7 +714,7 @@
             <w:noProof/>
             <w:webHidden/>
           </w:rPr>
-          <w:instrText xml:space="preserve"> PAGEREF _Toc243510550 \h </w:instrText>
+          <w:instrText xml:space="preserve"> PAGEREF _Toc243510652 \h </w:instrText>
         </w:r>
         <w:r>
           <w:rPr>
@@ -760,7 +760,7 @@
           <w14:ligatures w14:val="standardContextual"/>
         </w:rPr>
       </w:pPr>
-      <w:hyperlink w:anchor="_Toc243510551" w:history="1">
+      <w:hyperlink w:anchor="_Toc243510653" w:history="1">
         <w:r>
           <w:rPr>
             <w:rStyle w:val="Hipervnculo"/>
@@ -788,7 +788,7 @@
             <w:noProof/>
             <w:webHidden/>
           </w:rPr>
-          <w:instrText xml:space="preserve"> PAGEREF _Toc243510551 \h </w:instrText>
+          <w:instrText xml:space="preserve"> PAGEREF _Toc243510653 \h </w:instrText>
         </w:r>
         <w:r>
           <w:rPr>
@@ -834,7 +834,7 @@
           <w14:ligatures w14:val="standardContextual"/>
         </w:rPr>
       </w:pPr>
-      <w:hyperlink w:anchor="_Toc243510552" w:history="1">
+      <w:hyperlink w:anchor="_Toc243510654" w:history="1">
         <w:r>
           <w:rPr>
             <w:rStyle w:val="Hipervnculo"/>
@@ -862,7 +862,7 @@
             <w:noProof/>
             <w:webHidden/>
           </w:rPr>
-          <w:instrText xml:space="preserve"> PAGEREF _Toc243510552 \h </w:instrText>
+          <w:instrText xml:space="preserve"> PAGEREF _Toc243510654 \h </w:instrText>
         </w:r>
         <w:r>
           <w:rPr>
@@ -908,7 +908,7 @@
           <w14:ligatures w14:val="standardContextual"/>
         </w:rPr>
       </w:pPr>
-      <w:hyperlink w:anchor="_Toc243510553" w:history="1">
+      <w:hyperlink w:anchor="_Toc243510655" w:history="1">
         <w:r>
           <w:rPr>
             <w:rStyle w:val="Hipervnculo"/>
@@ -936,7 +936,7 @@
             <w:noProof/>
             <w:webHidden/>
           </w:rPr>
-          <w:instrText xml:space="preserve"> PAGEREF _Toc243510553 \h </w:instrText>
+          <w:instrText xml:space="preserve"> PAGEREF _Toc243510655 \h </w:instrText>
         </w:r>
         <w:r>
           <w:rPr>
@@ -982,7 +982,7 @@
           <w14:ligatures w14:val="standardContextual"/>
         </w:rPr>
       </w:pPr>
-      <w:hyperlink w:anchor="_Toc243510554" w:history="1">
+      <w:hyperlink w:anchor="_Toc243510656" w:history="1">
         <w:r>
           <w:rPr>
             <w:rStyle w:val="Hipervnculo"/>
@@ -1010,7 +1010,7 @@
             <w:noProof/>
             <w:webHidden/>
           </w:rPr>
-          <w:instrText xml:space="preserve"> PAGEREF _Toc243510554 \h </w:instrText>
+          <w:instrText xml:space="preserve"> PAGEREF _Toc243510656 \h </w:instrText>
         </w:r>
         <w:r>
           <w:rPr>
@@ -1056,7 +1056,7 @@
           <w14:ligatures w14:val="standardContextual"/>
         </w:rPr>
       </w:pPr>
-      <w:hyperlink w:anchor="_Toc243510555" w:history="1">
+      <w:hyperlink w:anchor="_Toc243510657" w:history="1">
         <w:r>
           <w:rPr>
             <w:rStyle w:val="Hipervnculo"/>
@@ -1084,7 +1084,7 @@
             <w:noProof/>
             <w:webHidden/>
           </w:rPr>
-          <w:instrText xml:space="preserve"> PAGEREF _Toc243510555 \h </w:instrText>
+          <w:instrText xml:space="preserve"> PAGEREF _Toc243510657 \h </w:instrText>
         </w:r>
         <w:r>
           <w:rPr>
@@ -1130,7 +1130,7 @@
           <w14:ligatures w14:val="standardContextual"/>
         </w:rPr>
       </w:pPr>
-      <w:hyperlink w:anchor="_Toc243510556" w:history="1">
+      <w:hyperlink w:anchor="_Toc243510658" w:history="1">
         <w:r>
           <w:rPr>
             <w:rStyle w:val="Hipervnculo"/>
@@ -1158,7 +1158,7 @@
             <w:noProof/>
             <w:webHidden/>
           </w:rPr>
-          <w:instrText xml:space="preserve"> PAGEREF _Toc243510556 \h </w:instrText>
+          <w:instrText xml:space="preserve"> PAGEREF _Toc243510658 \h </w:instrText>
         </w:r>
         <w:r>
           <w:rPr>
@@ -1204,7 +1204,7 @@
           <w14:ligatures w14:val="standardContextual"/>
         </w:rPr>
       </w:pPr>
-      <w:hyperlink w:anchor="_Toc243510557" w:history="1">
+      <w:hyperlink w:anchor="_Toc243510659" w:history="1">
         <w:r>
           <w:rPr>
             <w:rStyle w:val="Hipervnculo"/>
@@ -1232,7 +1232,7 @@
             <w:noProof/>
             <w:webHidden/>
           </w:rPr>
-          <w:instrText xml:space="preserve"> PAGEREF _Toc243510557 \h </w:instrText>
+          <w:instrText xml:space="preserve"> PAGEREF _Toc243510659 \h </w:instrText>
         </w:r>
         <w:r>
           <w:rPr>
@@ -1278,7 +1278,7 @@
           <w14:ligatures w14:val="standardContextual"/>
         </w:rPr>
       </w:pPr>
-      <w:hyperlink w:anchor="_Toc243510558" w:history="1">
+      <w:hyperlink w:anchor="_Toc243510660" w:history="1">
         <w:r>
           <w:rPr>
             <w:rStyle w:val="Hipervnculo"/>
@@ -1306,7 +1306,7 @@
             <w:noProof/>
             <w:webHidden/>
           </w:rPr>
-          <w:instrText xml:space="preserve"> PAGEREF _Toc243510558 \h </w:instrText>
+          <w:instrText xml:space="preserve"> PAGEREF _Toc243510660 \h </w:instrText>
         </w:r>
         <w:r>
           <w:rPr>
@@ -1352,7 +1352,7 @@
           <w14:ligatures w14:val="standardContextual"/>
         </w:rPr>
       </w:pPr>
-      <w:hyperlink w:anchor="_Toc243510559" w:history="1">
+      <w:hyperlink w:anchor="_Toc243510661" w:history="1">
         <w:r>
           <w:rPr>
             <w:rStyle w:val="Hipervnculo"/>
@@ -1380,7 +1380,7 @@
             <w:noProof/>
             <w:webHidden/>
           </w:rPr>
-          <w:instrText xml:space="preserve"> PAGEREF _Toc243510559 \h </w:instrText>
+          <w:instrText xml:space="preserve"> PAGEREF _Toc243510661 \h </w:instrText>
         </w:r>
         <w:r>
           <w:rPr>
@@ -1426,7 +1426,7 @@
           <w14:ligatures w14:val="standardContextual"/>
         </w:rPr>
       </w:pPr>
-      <w:hyperlink w:anchor="_Toc243510560" w:history="1">
+      <w:hyperlink w:anchor="_Toc243510662" w:history="1">
         <w:r>
           <w:rPr>
             <w:rStyle w:val="Hipervnculo"/>
@@ -1454,7 +1454,7 @@
             <w:noProof/>
             <w:webHidden/>
           </w:rPr>
-          <w:instrText xml:space="preserve"> PAGEREF _Toc243510560 \h </w:instrText>
+          <w:instrText xml:space="preserve"> PAGEREF _Toc243510662 \h </w:instrText>
         </w:r>
         <w:r>
           <w:rPr>
@@ -1500,7 +1500,7 @@
           <w14:ligatures w14:val="standardContextual"/>
         </w:rPr>
       </w:pPr>
-      <w:hyperlink w:anchor="_Toc243510561" w:history="1">
+      <w:hyperlink w:anchor="_Toc243510663" w:history="1">
         <w:r>
           <w:rPr>
             <w:rStyle w:val="Hipervnculo"/>
@@ -1528,7 +1528,7 @@
             <w:noProof/>
             <w:webHidden/>
           </w:rPr>
-          <w:instrText xml:space="preserve"> PAGEREF _Toc243510561 \h </w:instrText>
+          <w:instrText xml:space="preserve"> PAGEREF _Toc243510663 \h </w:instrText>
         </w:r>
         <w:r>
           <w:rPr>
@@ -1574,7 +1574,7 @@
           <w14:ligatures w14:val="standardContextual"/>
         </w:rPr>
       </w:pPr>
-      <w:hyperlink w:anchor="_Toc243510562" w:history="1">
+      <w:hyperlink w:anchor="_Toc243510664" w:history="1">
         <w:r>
           <w:rPr>
             <w:rStyle w:val="Hipervnculo"/>
@@ -1602,7 +1602,7 @@
             <w:noProof/>
             <w:webHidden/>
           </w:rPr>
-          <w:instrText xml:space="preserve"> PAGEREF _Toc243510562 \h </w:instrText>
+          <w:instrText xml:space="preserve"> PAGEREF _Toc243510664 \h </w:instrText>
         </w:r>
         <w:r>
           <w:rPr>
@@ -1648,7 +1648,7 @@
           <w14:ligatures w14:val="standardContextual"/>
         </w:rPr>
       </w:pPr>
-      <w:hyperlink w:anchor="_Toc243510563" w:history="1">
+      <w:hyperlink w:anchor="_Toc243510665" w:history="1">
         <w:r>
           <w:rPr>
             <w:rStyle w:val="Hipervnculo"/>
@@ -1676,7 +1676,7 @@
             <w:noProof/>
             <w:webHidden/>
           </w:rPr>
-          <w:instrText xml:space="preserve"> PAGEREF _Toc243510563 \h </w:instrText>
+          <w:instrText xml:space="preserve"> PAGEREF _Toc243510665 \h </w:instrText>
         </w:r>
         <w:r>
           <w:rPr>
@@ -1722,7 +1722,7 @@
           <w14:ligatures w14:val="standardContextual"/>
         </w:rPr>
       </w:pPr>
-      <w:hyperlink w:anchor="_Toc243510564" w:history="1">
+      <w:hyperlink w:anchor="_Toc243510666" w:history="1">
         <w:r>
           <w:rPr>
             <w:rStyle w:val="Hipervnculo"/>
@@ -1750,7 +1750,7 @@
             <w:noProof/>
             <w:webHidden/>
           </w:rPr>
-          <w:instrText xml:space="preserve"> PAGEREF _Toc243510564 \h </w:instrText>
+          <w:instrText xml:space="preserve"> PAGEREF _Toc243510666 \h </w:instrText>
         </w:r>
         <w:r>
           <w:rPr>
@@ -1796,7 +1796,7 @@
           <w14:ligatures w14:val="standardContextual"/>
         </w:rPr>
       </w:pPr>
-      <w:hyperlink w:anchor="_Toc243510565" w:history="1">
+      <w:hyperlink w:anchor="_Toc243510667" w:history="1">
         <w:r>
           <w:rPr>
             <w:rStyle w:val="Hipervnculo"/>
@@ -1824,7 +1824,7 @@
             <w:noProof/>
             <w:webHidden/>
           </w:rPr>
-          <w:instrText xml:space="preserve"> PAGEREF _Toc243510565 \h </w:instrText>
+          <w:instrText xml:space="preserve"> PAGEREF _Toc243510667 \h </w:instrText>
         </w:r>
         <w:r>
           <w:rPr>
@@ -1870,7 +1870,7 @@
           <w14:ligatures w14:val="standardContextual"/>
         </w:rPr>
       </w:pPr>
-      <w:hyperlink w:anchor="_Toc243510566" w:history="1">
+      <w:hyperlink w:anchor="_Toc243510668" w:history="1">
         <w:r>
           <w:rPr>
             <w:rStyle w:val="Hipervnculo"/>
@@ -1898,7 +1898,7 @@
             <w:noProof/>
             <w:webHidden/>
           </w:rPr>
-          <w:instrText xml:space="preserve"> PAGEREF _Toc243510566 \h </w:instrText>
+          <w:instrText xml:space="preserve"> PAGEREF _Toc243510668 \h </w:instrText>
         </w:r>
         <w:r>
           <w:rPr>
@@ -1944,7 +1944,7 @@
           <w14:ligatures w14:val="standardContextual"/>
         </w:rPr>
       </w:pPr>
-      <w:hyperlink w:anchor="_Toc243510567" w:history="1">
+      <w:hyperlink w:anchor="_Toc243510669" w:history="1">
         <w:r>
           <w:rPr>
             <w:rStyle w:val="Hipervnculo"/>
@@ -1972,7 +1972,7 @@
             <w:noProof/>
             <w:webHidden/>
           </w:rPr>
-          <w:instrText xml:space="preserve"> PAGEREF _Toc243510567 \h </w:instrText>
+          <w:instrText xml:space="preserve"> PAGEREF _Toc243510669 \h </w:instrText>
         </w:r>
         <w:r>
           <w:rPr>
@@ -2018,7 +2018,7 @@
           <w14:ligatures w14:val="standardContextual"/>
         </w:rPr>
       </w:pPr>
-      <w:hyperlink w:anchor="_Toc243510568" w:history="1">
+      <w:hyperlink w:anchor="_Toc243510670" w:history="1">
         <w:r>
           <w:rPr>
             <w:rStyle w:val="Hipervnculo"/>
@@ -2046,7 +2046,7 @@
             <w:noProof/>
             <w:webHidden/>
           </w:rPr>
-          <w:instrText xml:space="preserve"> PAGEREF _Toc243510568 \h </w:instrText>
+          <w:instrText xml:space="preserve"> PAGEREF _Toc243510670 \h </w:instrText>
         </w:r>
         <w:r>
           <w:rPr>
@@ -2092,7 +2092,7 @@
           <w14:ligatures w14:val="standardContextual"/>
         </w:rPr>
       </w:pPr>
-      <w:hyperlink w:anchor="_Toc243510569" w:history="1">
+      <w:hyperlink w:anchor="_Toc243510671" w:history="1">
         <w:r>
           <w:rPr>
             <w:rStyle w:val="Hipervnculo"/>
@@ -2120,7 +2120,7 @@
             <w:noProof/>
             <w:webHidden/>
           </w:rPr>
-          <w:instrText xml:space="preserve"> PAGEREF _Toc243510569 \h </w:instrText>
+          <w:instrText xml:space="preserve"> PAGEREF _Toc243510671 \h </w:instrText>
         </w:r>
         <w:r>
           <w:rPr>
@@ -2166,7 +2166,7 @@
           <w14:ligatures w14:val="standardContextual"/>
         </w:rPr>
       </w:pPr>
-      <w:hyperlink w:anchor="_Toc243510570" w:history="1">
+      <w:hyperlink w:anchor="_Toc243510672" w:history="1">
         <w:r>
           <w:rPr>
             <w:rStyle w:val="Hipervnculo"/>
@@ -2194,7 +2194,7 @@
             <w:noProof/>
             <w:webHidden/>
           </w:rPr>
-          <w:instrText xml:space="preserve"> PAGEREF _Toc243510570 \h </w:instrText>
+          <w:instrText xml:space="preserve"> PAGEREF _Toc243510672 \h </w:instrText>
         </w:r>
         <w:r>
           <w:rPr>
@@ -2240,7 +2240,7 @@
           <w14:ligatures w14:val="standardContextual"/>
         </w:rPr>
       </w:pPr>
-      <w:hyperlink w:anchor="_Toc243510571" w:history="1">
+      <w:hyperlink w:anchor="_Toc243510673" w:history="1">
         <w:r>
           <w:rPr>
             <w:rStyle w:val="Hipervnculo"/>
@@ -2268,7 +2268,7 @@
             <w:noProof/>
             <w:webHidden/>
           </w:rPr>
-          <w:instrText xml:space="preserve"> PAGEREF _Toc243510571 \h </w:instrText>
+          <w:instrText xml:space="preserve"> PAGEREF _Toc243510673 \h </w:instrText>
         </w:r>
         <w:r>
           <w:rPr>
@@ -2314,7 +2314,7 @@
           <w14:ligatures w14:val="standardContextual"/>
         </w:rPr>
       </w:pPr>
-      <w:hyperlink w:anchor="_Toc243510572" w:history="1">
+      <w:hyperlink w:anchor="_Toc243510674" w:history="1">
         <w:r>
           <w:rPr>
             <w:rStyle w:val="Hipervnculo"/>
@@ -2342,7 +2342,7 @@
             <w:noProof/>
             <w:webHidden/>
           </w:rPr>
-          <w:instrText xml:space="preserve"> PAGEREF _Toc243510572 \h </w:instrText>
+          <w:instrText xml:space="preserve"> PAGEREF _Toc243510674 \h </w:instrText>
         </w:r>
         <w:r>
           <w:rPr>
@@ -2388,7 +2388,7 @@
           <w14:ligatures w14:val="standardContextual"/>
         </w:rPr>
       </w:pPr>
-      <w:hyperlink w:anchor="_Toc243510573" w:history="1">
+      <w:hyperlink w:anchor="_Toc243510675" w:history="1">
         <w:r>
           <w:rPr>
             <w:rStyle w:val="Hipervnculo"/>
@@ -2416,7 +2416,7 @@
             <w:noProof/>
             <w:webHidden/>
           </w:rPr>
-          <w:instrText xml:space="preserve"> PAGEREF _Toc243510573 \h </w:instrText>
+          <w:instrText xml:space="preserve"> PAGEREF _Toc243510675 \h </w:instrText>
         </w:r>
         <w:r>
           <w:rPr>
@@ -2462,7 +2462,7 @@
           <w14:ligatures w14:val="standardContextual"/>
         </w:rPr>
       </w:pPr>
-      <w:hyperlink w:anchor="_Toc243510574" w:history="1">
+      <w:hyperlink w:anchor="_Toc243510676" w:history="1">
         <w:r>
           <w:rPr>
             <w:rStyle w:val="Hipervnculo"/>
@@ -2490,7 +2490,7 @@
             <w:noProof/>
             <w:webHidden/>
           </w:rPr>
-          <w:instrText xml:space="preserve"> PAGEREF _Toc243510574 \h </w:instrText>
+          <w:instrText xml:space="preserve"> PAGEREF _Toc243510676 \h </w:instrText>
         </w:r>
         <w:r>
           <w:rPr>
@@ -2536,7 +2536,7 @@
           <w14:ligatures w14:val="standardContextual"/>
         </w:rPr>
       </w:pPr>
-      <w:hyperlink w:anchor="_Toc243510575" w:history="1">
+      <w:hyperlink w:anchor="_Toc243510677" w:history="1">
         <w:r>
           <w:rPr>
             <w:rStyle w:val="Hipervnculo"/>
@@ -2564,7 +2564,7 @@
             <w:noProof/>
             <w:webHidden/>
           </w:rPr>
-          <w:instrText xml:space="preserve"> PAGEREF _Toc243510575 \h </w:instrText>
+          <w:instrText xml:space="preserve"> PAGEREF _Toc243510677 \h </w:instrText>
         </w:r>
         <w:r>
           <w:rPr>
@@ -2610,7 +2610,7 @@
           <w14:ligatures w14:val="standardContextual"/>
         </w:rPr>
       </w:pPr>
-      <w:hyperlink w:anchor="_Toc243510576" w:history="1">
+      <w:hyperlink w:anchor="_Toc243510678" w:history="1">
         <w:r>
           <w:rPr>
             <w:rStyle w:val="Hipervnculo"/>
@@ -2638,7 +2638,7 @@
             <w:noProof/>
             <w:webHidden/>
           </w:rPr>
-          <w:instrText xml:space="preserve"> PAGEREF _Toc243510576 \h </w:instrText>
+          <w:instrText xml:space="preserve"> PAGEREF _Toc243510678 \h </w:instrText>
         </w:r>
         <w:r>
           <w:rPr>
@@ -2684,7 +2684,7 @@
           <w14:ligatures w14:val="standardContextual"/>
         </w:rPr>
       </w:pPr>
-      <w:hyperlink w:anchor="_Toc243510577" w:history="1">
+      <w:hyperlink w:anchor="_Toc243510679" w:history="1">
         <w:r>
           <w:rPr>
             <w:rStyle w:val="Hipervnculo"/>
@@ -2712,7 +2712,7 @@
             <w:noProof/>
             <w:webHidden/>
           </w:rPr>
-          <w:instrText xml:space="preserve"> PAGEREF _Toc243510577 \h </w:instrText>
+          <w:instrText xml:space="preserve"> PAGEREF _Toc243510679 \h </w:instrText>
         </w:r>
         <w:r>
           <w:rPr>
@@ -2758,7 +2758,7 @@
           <w14:ligatures w14:val="standardContextual"/>
         </w:rPr>
       </w:pPr>
-      <w:hyperlink w:anchor="_Toc243510578" w:history="1">
+      <w:hyperlink w:anchor="_Toc243510680" w:history="1">
         <w:r>
           <w:rPr>
             <w:rStyle w:val="Hipervnculo"/>
@@ -2786,7 +2786,7 @@
             <w:noProof/>
             <w:webHidden/>
           </w:rPr>
-          <w:instrText xml:space="preserve"> PAGEREF _Toc243510578 \h </w:instrText>
+          <w:instrText xml:space="preserve"> PAGEREF _Toc243510680 \h </w:instrText>
         </w:r>
         <w:r>
           <w:rPr>
@@ -2832,7 +2832,7 @@
           <w14:ligatures w14:val="standardContextual"/>
         </w:rPr>
       </w:pPr>
-      <w:hyperlink w:anchor="_Toc243510579" w:history="1">
+      <w:hyperlink w:anchor="_Toc243510681" w:history="1">
         <w:r>
           <w:rPr>
             <w:rStyle w:val="Hipervnculo"/>
@@ -2860,7 +2860,7 @@
             <w:noProof/>
             <w:webHidden/>
           </w:rPr>
-          <w:instrText xml:space="preserve"> PAGEREF _Toc243510579 \h </w:instrText>
+          <w:instrText xml:space="preserve"> PAGEREF _Toc243510681 \h </w:instrText>
         </w:r>
         <w:r>
           <w:rPr>
@@ -2906,7 +2906,7 @@
           <w14:ligatures w14:val="standardContextual"/>
         </w:rPr>
       </w:pPr>
-      <w:hyperlink w:anchor="_Toc243510580" w:history="1">
+      <w:hyperlink w:anchor="_Toc243510682" w:history="1">
         <w:r>
           <w:rPr>
             <w:rStyle w:val="Hipervnculo"/>
@@ -2934,7 +2934,7 @@
             <w:noProof/>
             <w:webHidden/>
           </w:rPr>
-          <w:instrText xml:space="preserve"> PAGEREF _Toc243510580 \h </w:instrText>
+          <w:instrText xml:space="preserve"> PAGEREF _Toc243510682 \h </w:instrText>
         </w:r>
         <w:r>
           <w:rPr>
@@ -2980,7 +2980,7 @@
           <w14:ligatures w14:val="standardContextual"/>
         </w:rPr>
       </w:pPr>
-      <w:hyperlink w:anchor="_Toc243510581" w:history="1">
+      <w:hyperlink w:anchor="_Toc243510683" w:history="1">
         <w:r>
           <w:rPr>
             <w:rStyle w:val="Hipervnculo"/>
@@ -3008,7 +3008,7 @@
             <w:noProof/>
             <w:webHidden/>
           </w:rPr>
-          <w:instrText xml:space="preserve"> PAGEREF _Toc243510581 \h </w:instrText>
+          <w:instrText xml:space="preserve"> PAGEREF _Toc243510683 \h </w:instrText>
         </w:r>
         <w:r>
           <w:rPr>
@@ -3054,7 +3054,7 @@
           <w14:ligatures w14:val="standardContextual"/>
         </w:rPr>
       </w:pPr>
-      <w:hyperlink w:anchor="_Toc243510582" w:history="1">
+      <w:hyperlink w:anchor="_Toc243510684" w:history="1">
         <w:r>
           <w:rPr>
             <w:rStyle w:val="Hipervnculo"/>
@@ -3082,7 +3082,7 @@
             <w:noProof/>
             <w:webHidden/>
           </w:rPr>
-          <w:instrText xml:space="preserve"> PAGEREF _Toc243510582 \h </w:instrText>
+          <w:instrText xml:space="preserve"> PAGEREF _Toc243510684 \h </w:instrText>
         </w:r>
         <w:r>
           <w:rPr>
@@ -3128,7 +3128,7 @@
           <w14:ligatures w14:val="standardContextual"/>
         </w:rPr>
       </w:pPr>
-      <w:hyperlink w:anchor="_Toc243510583" w:history="1">
+      <w:hyperlink w:anchor="_Toc243510685" w:history="1">
         <w:r>
           <w:rPr>
             <w:rStyle w:val="Hipervnculo"/>
@@ -3156,7 +3156,7 @@
             <w:noProof/>
             <w:webHidden/>
           </w:rPr>
-          <w:instrText xml:space="preserve"> PAGEREF _Toc243510583 \h </w:instrText>
+          <w:instrText xml:space="preserve"> PAGEREF _Toc243510685 \h </w:instrText>
         </w:r>
         <w:r>
           <w:rPr>
@@ -3202,7 +3202,7 @@
           <w14:ligatures w14:val="standardContextual"/>
         </w:rPr>
       </w:pPr>
-      <w:hyperlink w:anchor="_Toc243510584" w:history="1">
+      <w:hyperlink w:anchor="_Toc243510686" w:history="1">
         <w:r>
           <w:rPr>
             <w:rStyle w:val="Hipervnculo"/>
@@ -3230,7 +3230,7 @@
             <w:noProof/>
             <w:webHidden/>
           </w:rPr>
-          <w:instrText xml:space="preserve"> PAGEREF _Toc243510584 \h </w:instrText>
+          <w:instrText xml:space="preserve"> PAGEREF _Toc243510686 \h </w:instrText>
         </w:r>
         <w:r>
           <w:rPr>
@@ -3276,7 +3276,7 @@
           <w14:ligatures w14:val="standardContextual"/>
         </w:rPr>
       </w:pPr>
-      <w:hyperlink w:anchor="_Toc243510585" w:history="1">
+      <w:hyperlink w:anchor="_Toc243510687" w:history="1">
         <w:r>
           <w:rPr>
             <w:rStyle w:val="Hipervnculo"/>
@@ -3304,7 +3304,7 @@
             <w:noProof/>
             <w:webHidden/>
           </w:rPr>
-          <w:instrText xml:space="preserve"> PAGEREF _Toc243510585 \h </w:instrText>
+          <w:instrText xml:space="preserve"> PAGEREF _Toc243510687 \h </w:instrText>
         </w:r>
         <w:r>
           <w:rPr>
@@ -3350,7 +3350,7 @@
           <w14:ligatures w14:val="standardContextual"/>
         </w:rPr>
       </w:pPr>
-      <w:hyperlink w:anchor="_Toc243510586" w:history="1">
+      <w:hyperlink w:anchor="_Toc243510688" w:history="1">
         <w:r>
           <w:rPr>
             <w:rStyle w:val="Hipervnculo"/>
@@ -3378,7 +3378,7 @@
             <w:noProof/>
             <w:webHidden/>
           </w:rPr>
-          <w:instrText xml:space="preserve"> PAGEREF _Toc243510586 \h </w:instrText>
+          <w:instrText xml:space="preserve"> PAGEREF _Toc243510688 \h </w:instrText>
         </w:r>
         <w:r>
           <w:rPr>
@@ -3424,7 +3424,7 @@
           <w14:ligatures w14:val="standardContextual"/>
         </w:rPr>
       </w:pPr>
-      <w:hyperlink w:anchor="_Toc243510587" w:history="1">
+      <w:hyperlink w:anchor="_Toc243510689" w:history="1">
         <w:r>
           <w:rPr>
             <w:rStyle w:val="Hipervnculo"/>
@@ -3452,7 +3452,7 @@
             <w:noProof/>
             <w:webHidden/>
           </w:rPr>
-          <w:instrText xml:space="preserve"> PAGEREF _Toc243510587 \h </w:instrText>
+          <w:instrText xml:space="preserve"> PAGEREF _Toc243510689 \h </w:instrText>
         </w:r>
         <w:r>
           <w:rPr>
@@ -3498,7 +3498,7 @@
           <w14:ligatures w14:val="standardContextual"/>
         </w:rPr>
       </w:pPr>
-      <w:hyperlink w:anchor="_Toc243510588" w:history="1">
+      <w:hyperlink w:anchor="_Toc243510690" w:history="1">
         <w:r>
           <w:rPr>
             <w:rStyle w:val="Hipervnculo"/>
@@ -3526,7 +3526,7 @@
             <w:noProof/>
             <w:webHidden/>
           </w:rPr>
-          <w:instrText xml:space="preserve"> PAGEREF _Toc243510588 \h </w:instrText>
+          <w:instrText xml:space="preserve"> PAGEREF _Toc243510690 \h </w:instrText>
         </w:r>
         <w:r>
           <w:rPr>
@@ -3572,7 +3572,7 @@
           <w14:ligatures w14:val="standardContextual"/>
         </w:rPr>
       </w:pPr>
-      <w:hyperlink w:anchor="_Toc243510589" w:history="1">
+      <w:hyperlink w:anchor="_Toc243510691" w:history="1">
         <w:r>
           <w:rPr>
             <w:rStyle w:val="Hipervnculo"/>
@@ -3600,7 +3600,7 @@
             <w:noProof/>
             <w:webHidden/>
           </w:rPr>
-          <w:instrText xml:space="preserve"> PAGEREF _Toc243510589 \h </w:instrText>
+          <w:instrText xml:space="preserve"> PAGEREF _Toc243510691 \h </w:instrText>
         </w:r>
         <w:r>
           <w:rPr>
@@ -3646,7 +3646,7 @@
           <w14:ligatures w14:val="standardContextual"/>
         </w:rPr>
       </w:pPr>
-      <w:hyperlink w:anchor="_Toc243510590" w:history="1">
+      <w:hyperlink w:anchor="_Toc243510692" w:history="1">
         <w:r>
           <w:rPr>
             <w:rStyle w:val="Hipervnculo"/>
@@ -3674,7 +3674,7 @@
             <w:noProof/>
             <w:webHidden/>
           </w:rPr>
-          <w:instrText xml:space="preserve"> PAGEREF _Toc243510590 \h </w:instrText>
+          <w:instrText xml:space="preserve"> PAGEREF _Toc243510692 \h </w:instrText>
         </w:r>
         <w:r>
           <w:rPr>
@@ -3720,7 +3720,7 @@
           <w14:ligatures w14:val="standardContextual"/>
         </w:rPr>
       </w:pPr>
-      <w:hyperlink w:anchor="_Toc243510591" w:history="1">
+      <w:hyperlink w:anchor="_Toc243510693" w:history="1">
         <w:r>
           <w:rPr>
             <w:rStyle w:val="Hipervnculo"/>
@@ -3748,7 +3748,7 @@
             <w:noProof/>
             <w:webHidden/>
           </w:rPr>
-          <w:instrText xml:space="preserve"> PAGEREF _Toc243510591 \h </w:instrText>
+          <w:instrText xml:space="preserve"> PAGEREF _Toc243510693 \h </w:instrText>
         </w:r>
         <w:r>
           <w:rPr>
@@ -3794,7 +3794,7 @@
           <w14:ligatures w14:val="standardContextual"/>
         </w:rPr>
       </w:pPr>
-      <w:hyperlink w:anchor="_Toc243510592" w:history="1">
+      <w:hyperlink w:anchor="_Toc243510694" w:history="1">
         <w:r>
           <w:rPr>
             <w:rStyle w:val="Hipervnculo"/>
@@ -3822,7 +3822,7 @@
             <w:noProof/>
             <w:webHidden/>
           </w:rPr>
-          <w:instrText xml:space="preserve"> PAGEREF _Toc243510592 \h </w:instrText>
+          <w:instrText xml:space="preserve"> PAGEREF _Toc243510694 \h </w:instrText>
         </w:r>
         <w:r>
           <w:rPr>
@@ -3868,7 +3868,7 @@
           <w14:ligatures w14:val="standardContextual"/>
         </w:rPr>
       </w:pPr>
-      <w:hyperlink w:anchor="_Toc243510593" w:history="1">
+      <w:hyperlink w:anchor="_Toc243510695" w:history="1">
         <w:r>
           <w:rPr>
             <w:rStyle w:val="Hipervnculo"/>
@@ -3896,7 +3896,7 @@
             <w:noProof/>
             <w:webHidden/>
           </w:rPr>
-          <w:instrText xml:space="preserve"> PAGEREF _Toc243510593 \h </w:instrText>
+          <w:instrText xml:space="preserve"> PAGEREF _Toc243510695 \h </w:instrText>
         </w:r>
         <w:r>
           <w:rPr>
@@ -3942,7 +3942,7 @@
           <w14:ligatures w14:val="standardContextual"/>
         </w:rPr>
       </w:pPr>
-      <w:hyperlink w:anchor="_Toc243510594" w:history="1">
+      <w:hyperlink w:anchor="_Toc243510696" w:history="1">
         <w:r>
           <w:rPr>
             <w:rStyle w:val="Hipervnculo"/>
@@ -3970,7 +3970,7 @@
             <w:noProof/>
             <w:webHidden/>
           </w:rPr>
-          <w:instrText xml:space="preserve"> PAGEREF _Toc243510594 \h </w:instrText>
+          <w:instrText xml:space="preserve"> PAGEREF _Toc243510696 \h </w:instrText>
         </w:r>
         <w:r>
           <w:rPr>
@@ -4016,7 +4016,7 @@
           <w14:ligatures w14:val="standardContextual"/>
         </w:rPr>
       </w:pPr>
-      <w:hyperlink w:anchor="_Toc243510595" w:history="1">
+      <w:hyperlink w:anchor="_Toc243510697" w:history="1">
         <w:r>
           <w:rPr>
             <w:rStyle w:val="Hipervnculo"/>
@@ -4044,7 +4044,7 @@
             <w:noProof/>
             <w:webHidden/>
           </w:rPr>
-          <w:instrText xml:space="preserve"> PAGEREF _Toc243510595 \h </w:instrText>
+          <w:instrText xml:space="preserve"> PAGEREF _Toc243510697 \h </w:instrText>
         </w:r>
         <w:r>
           <w:rPr>
@@ -4090,7 +4090,7 @@
           <w14:ligatures w14:val="standardContextual"/>
         </w:rPr>
       </w:pPr>
-      <w:hyperlink w:anchor="_Toc243510596" w:history="1">
+      <w:hyperlink w:anchor="_Toc243510698" w:history="1">
         <w:r>
           <w:rPr>
             <w:rStyle w:val="Hipervnculo"/>
@@ -4118,7 +4118,7 @@
             <w:noProof/>
             <w:webHidden/>
           </w:rPr>
-          <w:instrText xml:space="preserve"> PAGEREF _Toc243510596 \h </w:instrText>
+          <w:instrText xml:space="preserve"> PAGEREF _Toc243510698 \h </w:instrText>
         </w:r>
         <w:r>
           <w:rPr>
@@ -4138,7 +4138,7 @@
             <w:noProof/>
             <w:webHidden/>
           </w:rPr>
-          <w:t>60</w:t>
+          <w:t>61</w:t>
         </w:r>
         <w:r>
           <w:rPr>
@@ -4164,7 +4164,7 @@
           <w14:ligatures w14:val="standardContextual"/>
         </w:rPr>
       </w:pPr>
-      <w:hyperlink w:anchor="_Toc243510597" w:history="1">
+      <w:hyperlink w:anchor="_Toc243510699" w:history="1">
         <w:r>
           <w:rPr>
             <w:rStyle w:val="Hipervnculo"/>
@@ -4192,7 +4192,7 @@
             <w:noProof/>
             <w:webHidden/>
           </w:rPr>
-          <w:instrText xml:space="preserve"> PAGEREF _Toc243510597 \h </w:instrText>
+          <w:instrText xml:space="preserve"> PAGEREF _Toc243510699 \h </w:instrText>
         </w:r>
         <w:r>
           <w:rPr>
@@ -4212,7 +4212,7 @@
             <w:noProof/>
             <w:webHidden/>
           </w:rPr>
-          <w:t>63</w:t>
+          <w:t>64</w:t>
         </w:r>
         <w:r>
           <w:rPr>
@@ -4238,7 +4238,7 @@
           <w14:ligatures w14:val="standardContextual"/>
         </w:rPr>
       </w:pPr>
-      <w:hyperlink w:anchor="_Toc243510598" w:history="1">
+      <w:hyperlink w:anchor="_Toc243510700" w:history="1">
         <w:r>
           <w:rPr>
             <w:rStyle w:val="Hipervnculo"/>
@@ -4266,7 +4266,7 @@
             <w:noProof/>
             <w:webHidden/>
           </w:rPr>
-          <w:instrText xml:space="preserve"> PAGEREF _Toc243510598 \h </w:instrText>
+          <w:instrText xml:space="preserve"> PAGEREF _Toc243510700 \h </w:instrText>
         </w:r>
         <w:r>
           <w:rPr>
@@ -4286,7 +4286,7 @@
             <w:noProof/>
             <w:webHidden/>
           </w:rPr>
-          <w:t>66</w:t>
+          <w:t>67</w:t>
         </w:r>
         <w:r>
           <w:rPr>
@@ -4312,7 +4312,7 @@
           <w14:ligatures w14:val="standardContextual"/>
         </w:rPr>
       </w:pPr>
-      <w:hyperlink w:anchor="_Toc243510599" w:history="1">
+      <w:hyperlink w:anchor="_Toc243510701" w:history="1">
         <w:r>
           <w:rPr>
             <w:rStyle w:val="Hipervnculo"/>
@@ -4340,7 +4340,7 @@
             <w:noProof/>
             <w:webHidden/>
           </w:rPr>
-          <w:instrText xml:space="preserve"> PAGEREF _Toc243510599 \h </w:instrText>
+          <w:instrText xml:space="preserve"> PAGEREF _Toc243510701 \h </w:instrText>
         </w:r>
         <w:r>
           <w:rPr>
@@ -4360,7 +4360,7 @@
             <w:noProof/>
             <w:webHidden/>
           </w:rPr>
-          <w:t>68</w:t>
+          <w:t>69</w:t>
         </w:r>
         <w:r>
           <w:rPr>
@@ -4386,7 +4386,7 @@
           <w14:ligatures w14:val="standardContextual"/>
         </w:rPr>
       </w:pPr>
-      <w:hyperlink w:anchor="_Toc243510600" w:history="1">
+      <w:hyperlink w:anchor="_Toc243510702" w:history="1">
         <w:r>
           <w:rPr>
             <w:rStyle w:val="Hipervnculo"/>
@@ -4414,7 +4414,7 @@
             <w:noProof/>
             <w:webHidden/>
           </w:rPr>
-          <w:instrText xml:space="preserve"> PAGEREF _Toc243510600 \h </w:instrText>
+          <w:instrText xml:space="preserve"> PAGEREF _Toc243510702 \h </w:instrText>
         </w:r>
         <w:r>
           <w:rPr>
@@ -4434,7 +4434,7 @@
             <w:noProof/>
             <w:webHidden/>
           </w:rPr>
-          <w:t>68</w:t>
+          <w:t>69</w:t>
         </w:r>
         <w:r>
           <w:rPr>
@@ -4474,7 +4474,7 @@
       <w:pPr>
         <w:pStyle w:val="Ttulo1"/>
       </w:pPr>
-      <w:bookmarkStart w:id="1" w:name="_Toc243510544"/>
+      <w:bookmarkStart w:id="1" w:name="_Toc243510646"/>
       <w:r>
         <w:t>Introducción</w:t>
       </w:r>
@@ -4484,7 +4484,7 @@
       <w:pPr>
         <w:pStyle w:val="Ttulo2"/>
       </w:pPr>
-      <w:bookmarkStart w:id="2" w:name="_Toc243510545"/>
+      <w:bookmarkStart w:id="2" w:name="_Toc243510647"/>
       <w:r>
         <w:t>Los sistemas operativos distribuidos y su lugar en la infraestructura de TI</w:t>
       </w:r>
@@ -4546,7 +4546,7 @@
       <w:pPr>
         <w:pStyle w:val="Ttulo2"/>
       </w:pPr>
-      <w:bookmarkStart w:id="3" w:name="_Toc243510546"/>
+      <w:bookmarkStart w:id="3" w:name="_Toc243510648"/>
       <w:r>
         <w:t>El problema de la gestión de recursos y la planificación global</w:t>
       </w:r>
@@ -4584,7 +4584,7 @@
       <w:pPr>
         <w:pStyle w:val="Ttulo2"/>
       </w:pPr>
-      <w:bookmarkStart w:id="4" w:name="_Toc243510547"/>
+      <w:bookmarkStart w:id="4" w:name="_Toc243510649"/>
       <w:r>
         <w:t>Tres formas de estudiar un sistema distribuido</w:t>
       </w:r>
@@ -5357,7 +5357,7 @@
       <w:pPr>
         <w:pStyle w:val="Ttulo2"/>
       </w:pPr>
-      <w:bookmarkStart w:id="5" w:name="_Toc243510548"/>
+      <w:bookmarkStart w:id="5" w:name="_Toc243510650"/>
       <w:r>
         <w:t>La reproducibilidad como requisito científico y profesional</w:t>
       </w:r>
@@ -5425,7 +5425,7 @@
       <w:pPr>
         <w:pStyle w:val="Ttulo1"/>
       </w:pPr>
-      <w:bookmarkStart w:id="6" w:name="_Toc243510549"/>
+      <w:bookmarkStart w:id="6" w:name="_Toc243510651"/>
       <w:r>
         <w:t>Objetivos</w:t>
       </w:r>
@@ -5435,7 +5435,7 @@
       <w:pPr>
         <w:pStyle w:val="Ttulo2"/>
       </w:pPr>
-      <w:bookmarkStart w:id="7" w:name="_Toc243510550"/>
+      <w:bookmarkStart w:id="7" w:name="_Toc243510652"/>
       <w:r>
         <w:t>Objetivo general</w:t>
       </w:r>
@@ -5453,7 +5453,7 @@
       <w:pPr>
         <w:pStyle w:val="Ttulo2"/>
       </w:pPr>
-      <w:bookmarkStart w:id="8" w:name="_Toc243510551"/>
+      <w:bookmarkStart w:id="8" w:name="_Toc243510653"/>
       <w:r>
         <w:t>Objetivos específicos</w:t>
       </w:r>
@@ -5540,7 +5540,7 @@
       <w:pPr>
         <w:pStyle w:val="Ttulo1"/>
       </w:pPr>
-      <w:bookmarkStart w:id="9" w:name="_Toc243510552"/>
+      <w:bookmarkStart w:id="9" w:name="_Toc243510654"/>
       <w:r>
         <w:lastRenderedPageBreak/>
         <w:t>Investigación teórica</w:t>
@@ -5551,7 +5551,7 @@
       <w:pPr>
         <w:pStyle w:val="Ttulo2"/>
       </w:pPr>
-      <w:bookmarkStart w:id="10" w:name="_Toc243510553"/>
+      <w:bookmarkStart w:id="10" w:name="_Toc243510655"/>
       <w:r>
         <w:t>Planificación y balanceo de carga</w:t>
       </w:r>
@@ -6881,7 +6881,7 @@
       <w:pPr>
         <w:pStyle w:val="Ttulo2"/>
       </w:pPr>
-      <w:bookmarkStart w:id="11" w:name="_Toc243510554"/>
+      <w:bookmarkStart w:id="11" w:name="_Toc243510656"/>
       <w:r>
         <w:t>SimGrid</w:t>
       </w:r>
@@ -7077,7 +7077,7 @@
       <w:pPr>
         <w:pStyle w:val="Ttulo2"/>
       </w:pPr>
-      <w:bookmarkStart w:id="12" w:name="_Toc243510555"/>
+      <w:bookmarkStart w:id="12" w:name="_Toc243510657"/>
       <w:r>
         <w:t>Vagrant</w:t>
       </w:r>
@@ -7367,7 +7367,7 @@
       <w:pPr>
         <w:pStyle w:val="Ttulo2"/>
       </w:pPr>
-      <w:bookmarkStart w:id="13" w:name="_Toc243510556"/>
+      <w:bookmarkStart w:id="13" w:name="_Toc243510658"/>
       <w:r>
         <w:lastRenderedPageBreak/>
         <w:t>Ansible</w:t>
@@ -7564,7 +7564,7 @@
       <w:pPr>
         <w:pStyle w:val="Ttulo2"/>
       </w:pPr>
-      <w:bookmarkStart w:id="14" w:name="_Toc243510557"/>
+      <w:bookmarkStart w:id="14" w:name="_Toc243510659"/>
       <w:r>
         <w:t>Middleware de comunicación</w:t>
       </w:r>
@@ -7714,7 +7714,7 @@
       <w:pPr>
         <w:pStyle w:val="Ttulo2"/>
       </w:pPr>
-      <w:bookmarkStart w:id="15" w:name="_Toc243510558"/>
+      <w:bookmarkStart w:id="15" w:name="_Toc243510660"/>
       <w:r>
         <w:t>Emulación de red con tc y netem</w:t>
       </w:r>
@@ -7828,7 +7828,7 @@
       <w:pPr>
         <w:pStyle w:val="Ttulo2"/>
       </w:pPr>
-      <w:bookmarkStart w:id="16" w:name="_Toc243510559"/>
+      <w:bookmarkStart w:id="16" w:name="_Toc243510661"/>
       <w:r>
         <w:t>Monitoreo con Prometheus y Grafana</w:t>
       </w:r>
@@ -7877,7 +7877,7 @@
       <w:pPr>
         <w:pStyle w:val="Ttulo2"/>
       </w:pPr>
-      <w:bookmarkStart w:id="17" w:name="_Toc243510560"/>
+      <w:bookmarkStart w:id="17" w:name="_Toc243510662"/>
       <w:r>
         <w:t>Evaluación de desempeño</w:t>
       </w:r>
@@ -8023,7 +8023,7 @@
       <w:pPr>
         <w:pStyle w:val="Ttulo1"/>
       </w:pPr>
-      <w:bookmarkStart w:id="18" w:name="_Toc243510561"/>
+      <w:bookmarkStart w:id="18" w:name="_Toc243510663"/>
       <w:r>
         <w:t>Organización del equipo</w:t>
       </w:r>
@@ -8033,7 +8033,7 @@
       <w:pPr>
         <w:pStyle w:val="Ttulo2"/>
       </w:pPr>
-      <w:bookmarkStart w:id="19" w:name="_Toc243510562"/>
+      <w:bookmarkStart w:id="19" w:name="_Toc243510664"/>
       <w:r>
         <w:t>Diagnóstico de experiencia</w:t>
       </w:r>
@@ -8901,7 +8901,7 @@
       <w:pPr>
         <w:pStyle w:val="Ttulo2"/>
       </w:pPr>
-      <w:bookmarkStart w:id="20" w:name="_Toc243510563"/>
+      <w:bookmarkStart w:id="20" w:name="_Toc243510665"/>
       <w:r>
         <w:t>Roles y distribución de tareas</w:t>
       </w:r>
@@ -9276,7 +9276,7 @@
       <w:pPr>
         <w:pStyle w:val="Ttulo1"/>
       </w:pPr>
-      <w:bookmarkStart w:id="21" w:name="_Toc243510564"/>
+      <w:bookmarkStart w:id="21" w:name="_Toc243510666"/>
       <w:r>
         <w:t>Materiales y métodos</w:t>
       </w:r>
@@ -9286,7 +9286,7 @@
       <w:pPr>
         <w:pStyle w:val="Ttulo2"/>
       </w:pPr>
-      <w:bookmarkStart w:id="22" w:name="_Toc243510565"/>
+      <w:bookmarkStart w:id="22" w:name="_Toc243510667"/>
       <w:r>
         <w:t>Arquitectura del laboratorio</w:t>
       </w:r>
@@ -9394,7 +9394,7 @@
           <w:noProof/>
         </w:rPr>
         <w:drawing>
-          <wp:inline distT="0" distB="0" distL="0" distR="0" wp14:anchorId="313617B7" wp14:editId="03389BA1">
+          <wp:inline distT="0" distB="0" distL="0" distR="0" wp14:anchorId="735E87F5" wp14:editId="0C92A92F">
             <wp:extent cx="5760000" cy="3744000"/>
             <wp:effectExtent l="0" t="0" r="0" b="0"/>
             <wp:docPr id="1" name="Picture 1"/>
@@ -9722,7 +9722,7 @@
       <w:pPr>
         <w:pStyle w:val="Ttulo2"/>
       </w:pPr>
-      <w:bookmarkStart w:id="23" w:name="_Toc243510566"/>
+      <w:bookmarkStart w:id="23" w:name="_Toc243510668"/>
       <w:r>
         <w:t>Software y hardware</w:t>
       </w:r>
@@ -10295,7 +10295,7 @@
       <w:pPr>
         <w:pStyle w:val="Ttulo2"/>
       </w:pPr>
-      <w:bookmarkStart w:id="24" w:name="_Toc243510567"/>
+      <w:bookmarkStart w:id="24" w:name="_Toc243510669"/>
       <w:r>
         <w:t>Carga de trabajo</w:t>
       </w:r>
@@ -10926,7 +10926,7 @@
       <w:pPr>
         <w:pStyle w:val="Ttulo2"/>
       </w:pPr>
-      <w:bookmarkStart w:id="25" w:name="_Toc243510568"/>
+      <w:bookmarkStart w:id="25" w:name="_Toc243510670"/>
       <w:r>
         <w:t>Estrategias implementadas</w:t>
       </w:r>
@@ -11045,7 +11045,7 @@
       <w:pPr>
         <w:pStyle w:val="Ttulo2"/>
       </w:pPr>
-      <w:bookmarkStart w:id="26" w:name="_Toc243510569"/>
+      <w:bookmarkStart w:id="26" w:name="_Toc243510671"/>
       <w:r>
         <w:lastRenderedPageBreak/>
         <w:t>Diseño experimental</w:t>
@@ -11832,7 +11832,7 @@
       <w:pPr>
         <w:pStyle w:val="Ttulo2"/>
       </w:pPr>
-      <w:bookmarkStart w:id="27" w:name="_Toc243510570"/>
+      <w:bookmarkStart w:id="27" w:name="_Toc243510672"/>
       <w:r>
         <w:t>Modelo de simulación</w:t>
       </w:r>
@@ -12050,7 +12050,7 @@
       <w:pPr>
         <w:pStyle w:val="Ttulo1"/>
       </w:pPr>
-      <w:bookmarkStart w:id="28" w:name="_Toc243510571"/>
+      <w:bookmarkStart w:id="28" w:name="_Toc243510673"/>
       <w:r>
         <w:t>Implementación práctica</w:t>
       </w:r>
@@ -12068,7 +12068,7 @@
       <w:pPr>
         <w:pStyle w:val="Ttulo2"/>
       </w:pPr>
-      <w:bookmarkStart w:id="29" w:name="_Toc243510572"/>
+      <w:bookmarkStart w:id="29" w:name="_Toc243510674"/>
       <w:r>
         <w:lastRenderedPageBreak/>
         <w:t>Paso 0: diagnóstico y acta de roles</w:t>
@@ -12087,7 +12087,7 @@
       <w:pPr>
         <w:pStyle w:val="Ttulo2"/>
       </w:pPr>
-      <w:bookmarkStart w:id="30" w:name="_Toc243510573"/>
+      <w:bookmarkStart w:id="30" w:name="_Toc243510675"/>
       <w:r>
         <w:t>Paso 1: clúster como código con Vagrant</w:t>
       </w:r>
@@ -13377,7 +13377,7 @@
       <w:pPr>
         <w:pStyle w:val="Ttulo2"/>
       </w:pPr>
-      <w:bookmarkStart w:id="31" w:name="_Toc243510574"/>
+      <w:bookmarkStart w:id="31" w:name="_Toc243510676"/>
       <w:r>
         <w:t>Paso 2: aprovisionamiento con Ansible</w:t>
       </w:r>
@@ -13764,7 +13764,7 @@
       <w:pPr>
         <w:pStyle w:val="Ttulo2"/>
       </w:pPr>
-      <w:bookmarkStart w:id="32" w:name="_Toc243510575"/>
+      <w:bookmarkStart w:id="32" w:name="_Toc243510677"/>
       <w:r>
         <w:lastRenderedPageBreak/>
         <w:t>Paso 3: implementación de las estrategias</w:t>
@@ -14087,7 +14087,7 @@
       <w:pPr>
         <w:pStyle w:val="Ttulo2"/>
       </w:pPr>
-      <w:bookmarkStart w:id="33" w:name="_Toc243510576"/>
+      <w:bookmarkStart w:id="33" w:name="_Toc243510678"/>
       <w:r>
         <w:lastRenderedPageBreak/>
         <w:t>Paso 4: modelo en SimGrid</w:t>
@@ -14283,7 +14283,7 @@
       <w:pPr>
         <w:pStyle w:val="Ttulo2"/>
       </w:pPr>
-      <w:bookmarkStart w:id="34" w:name="_Toc243510577"/>
+      <w:bookmarkStart w:id="34" w:name="_Toc243510679"/>
       <w:r>
         <w:lastRenderedPageBreak/>
         <w:t>Paso 5: experimentación en el clúster real</w:t>
@@ -14375,7 +14375,7 @@
           <w:noProof/>
         </w:rPr>
         <w:drawing>
-          <wp:inline distT="0" distB="0" distL="0" distR="0" wp14:anchorId="2DB7224B" wp14:editId="65AB5091">
+          <wp:inline distT="0" distB="0" distL="0" distR="0" wp14:anchorId="71712831" wp14:editId="1D1FE1E1">
             <wp:extent cx="5760000" cy="3240000"/>
             <wp:effectExtent l="0" t="0" r="0" b="0"/>
             <wp:docPr id="2" name="Picture 2"/>
@@ -14433,7 +14433,7 @@
       <w:pPr>
         <w:pStyle w:val="Ttulo2"/>
       </w:pPr>
-      <w:bookmarkStart w:id="35" w:name="_Toc243510578"/>
+      <w:bookmarkStart w:id="35" w:name="_Toc243510680"/>
       <w:r>
         <w:lastRenderedPageBreak/>
         <w:t>Paso 6: calibración y validación</w:t>
@@ -15752,7 +15752,7 @@
           <w:noProof/>
         </w:rPr>
         <w:drawing>
-          <wp:inline distT="0" distB="0" distL="0" distR="0" wp14:anchorId="783EB9CB" wp14:editId="196A88E6">
+          <wp:inline distT="0" distB="0" distL="0" distR="0" wp14:anchorId="6B2934CD" wp14:editId="26DB81ED">
             <wp:extent cx="5760000" cy="1729324"/>
             <wp:effectExtent l="0" t="0" r="0" b="0"/>
             <wp:docPr id="3" name="Picture 3"/>
@@ -15806,7 +15806,7 @@
       <w:pPr>
         <w:pStyle w:val="Ttulo2"/>
       </w:pPr>
-      <w:bookmarkStart w:id="36" w:name="_Toc243510579"/>
+      <w:bookmarkStart w:id="36" w:name="_Toc243510681"/>
       <w:r>
         <w:t>Paso 7: extrapolación a gran escala</w:t>
       </w:r>
@@ -15846,7 +15846,7 @@
       <w:pPr>
         <w:pStyle w:val="Ttulo2"/>
       </w:pPr>
-      <w:bookmarkStart w:id="37" w:name="_Toc243510580"/>
+      <w:bookmarkStart w:id="37" w:name="_Toc243510682"/>
       <w:r>
         <w:t>Paso 8: prueba de reproducibilidad</w:t>
       </w:r>
@@ -15907,7 +15907,7 @@
       <w:pPr>
         <w:pStyle w:val="Ttulo1"/>
       </w:pPr>
-      <w:bookmarkStart w:id="38" w:name="_Toc243510581"/>
+      <w:bookmarkStart w:id="38" w:name="_Toc243510683"/>
       <w:r>
         <w:t>Análisis de resultados y discusión</w:t>
       </w:r>
@@ -15917,7 +15917,7 @@
       <w:pPr>
         <w:pStyle w:val="Ttulo2"/>
       </w:pPr>
-      <w:bookmarkStart w:id="39" w:name="_Toc243510582"/>
+      <w:bookmarkStart w:id="39" w:name="_Toc243510684"/>
       <w:r>
         <w:t>Desempeño y comparación de las estrategias</w:t>
       </w:r>
@@ -19647,7 +19647,7 @@
           <w:noProof/>
         </w:rPr>
         <w:drawing>
-          <wp:inline distT="0" distB="0" distL="0" distR="0" wp14:anchorId="2712A59D" wp14:editId="11684B82">
+          <wp:inline distT="0" distB="0" distL="0" distR="0" wp14:anchorId="4E1438D7" wp14:editId="78D55E7A">
             <wp:extent cx="5760000" cy="1962372"/>
             <wp:effectExtent l="0" t="0" r="0" b="0"/>
             <wp:docPr id="4" name="Picture 4"/>
@@ -20686,7 +20686,7 @@
           <w:noProof/>
         </w:rPr>
         <w:drawing>
-          <wp:inline distT="0" distB="0" distL="0" distR="0" wp14:anchorId="69257B0A" wp14:editId="5DEE0D0A">
+          <wp:inline distT="0" distB="0" distL="0" distR="0" wp14:anchorId="2C966E60" wp14:editId="22151CB0">
             <wp:extent cx="5760000" cy="1961470"/>
             <wp:effectExtent l="0" t="0" r="0" b="0"/>
             <wp:docPr id="5" name="Picture 5"/>
@@ -20787,7 +20787,7 @@
           <w:noProof/>
         </w:rPr>
         <w:drawing>
-          <wp:inline distT="0" distB="0" distL="0" distR="0" wp14:anchorId="107733BE" wp14:editId="4808C435">
+          <wp:inline distT="0" distB="0" distL="0" distR="0" wp14:anchorId="1EFA4E2D" wp14:editId="0395DDB5">
             <wp:extent cx="5760000" cy="1960569"/>
             <wp:effectExtent l="0" t="0" r="0" b="0"/>
             <wp:docPr id="6" name="Picture 6"/>
@@ -20848,7 +20848,7 @@
       <w:pPr>
         <w:pStyle w:val="Ttulo2"/>
       </w:pPr>
-      <w:bookmarkStart w:id="40" w:name="_Toc243510583"/>
+      <w:bookmarkStart w:id="40" w:name="_Toc243510685"/>
       <w:r>
         <w:t>Efecto de la heterogeneidad y de la latencia</w:t>
       </w:r>
@@ -20889,7 +20889,7 @@
       <w:pPr>
         <w:pStyle w:val="Ttulo2"/>
       </w:pPr>
-      <w:bookmarkStart w:id="41" w:name="_Toc243510584"/>
+      <w:bookmarkStart w:id="41" w:name="_Toc243510686"/>
       <w:r>
         <w:t>Validez del simulador</w:t>
       </w:r>
@@ -25019,7 +25019,7 @@
           <w:noProof/>
         </w:rPr>
         <w:drawing>
-          <wp:inline distT="0" distB="0" distL="0" distR="0" wp14:anchorId="135C0A56" wp14:editId="4D0539FE">
+          <wp:inline distT="0" distB="0" distL="0" distR="0" wp14:anchorId="27671590" wp14:editId="38B3009E">
             <wp:extent cx="5760000" cy="2313529"/>
             <wp:effectExtent l="0" t="0" r="0" b="0"/>
             <wp:docPr id="7" name="Picture 7"/>
@@ -25107,7 +25107,7 @@
           <w:noProof/>
         </w:rPr>
         <w:drawing>
-          <wp:inline distT="0" distB="0" distL="0" distR="0" wp14:anchorId="5C8E9A51" wp14:editId="65C2F57B">
+          <wp:inline distT="0" distB="0" distL="0" distR="0" wp14:anchorId="462B75EE" wp14:editId="0C57FEB6">
             <wp:extent cx="5760000" cy="1845000"/>
             <wp:effectExtent l="0" t="0" r="0" b="0"/>
             <wp:docPr id="8" name="Picture 8"/>
@@ -26166,7 +26166,7 @@
       <w:pPr>
         <w:pStyle w:val="Ttulo2"/>
       </w:pPr>
-      <w:bookmarkStart w:id="42" w:name="_Toc243510585"/>
+      <w:bookmarkStart w:id="42" w:name="_Toc243510687"/>
       <w:r>
         <w:lastRenderedPageBreak/>
         <w:t>Escalabilidad</w:t>
@@ -26238,7 +26238,7 @@
           <w:noProof/>
         </w:rPr>
         <w:drawing>
-          <wp:inline distT="0" distB="0" distL="0" distR="0" wp14:anchorId="03506AA5" wp14:editId="3F17F231">
+          <wp:inline distT="0" distB="0" distL="0" distR="0" wp14:anchorId="26D33807" wp14:editId="101928F5">
             <wp:extent cx="5760000" cy="2946138"/>
             <wp:effectExtent l="0" t="0" r="0" b="0"/>
             <wp:docPr id="9" name="Picture 9"/>
@@ -27585,7 +27585,7 @@
           <w:noProof/>
         </w:rPr>
         <w:drawing>
-          <wp:inline distT="0" distB="0" distL="0" distR="0" wp14:anchorId="14B308C3" wp14:editId="3363EBD8">
+          <wp:inline distT="0" distB="0" distL="0" distR="0" wp14:anchorId="3044EC43" wp14:editId="5F289517">
             <wp:extent cx="5760000" cy="2964706"/>
             <wp:effectExtent l="0" t="0" r="0" b="0"/>
             <wp:docPr id="10" name="Picture 10"/>
@@ -27685,7 +27685,7 @@
           <w:noProof/>
         </w:rPr>
         <w:drawing>
-          <wp:inline distT="0" distB="0" distL="0" distR="0" wp14:anchorId="1B5B907E" wp14:editId="22C2EF24">
+          <wp:inline distT="0" distB="0" distL="0" distR="0" wp14:anchorId="32EC6986" wp14:editId="32990F2D">
             <wp:extent cx="5760000" cy="2965952"/>
             <wp:effectExtent l="0" t="0" r="0" b="0"/>
             <wp:docPr id="11" name="Picture 11"/>
@@ -27773,7 +27773,7 @@
           <w:noProof/>
         </w:rPr>
         <w:drawing>
-          <wp:inline distT="0" distB="0" distL="0" distR="0" wp14:anchorId="2B5D08DA" wp14:editId="2B2965B1">
+          <wp:inline distT="0" distB="0" distL="0" distR="0" wp14:anchorId="34E7EE7D" wp14:editId="40B513A4">
             <wp:extent cx="5760000" cy="2079853"/>
             <wp:effectExtent l="0" t="0" r="0" b="0"/>
             <wp:docPr id="12" name="Picture 12"/>
@@ -27852,7 +27852,7 @@
       <w:pPr>
         <w:pStyle w:val="Ttulo2"/>
       </w:pPr>
-      <w:bookmarkStart w:id="43" w:name="_Toc243510586"/>
+      <w:bookmarkStart w:id="43" w:name="_Toc243510688"/>
       <w:r>
         <w:t>Consumo de recursos</w:t>
       </w:r>
@@ -28211,7 +28211,7 @@
       <w:pPr>
         <w:pStyle w:val="Ttulo2"/>
       </w:pPr>
-      <w:bookmarkStart w:id="44" w:name="_Toc243510587"/>
+      <w:bookmarkStart w:id="44" w:name="_Toc243510689"/>
       <w:r>
         <w:t>Ventajas y desafíos</w:t>
       </w:r>
@@ -28370,7 +28370,7 @@
       <w:pPr>
         <w:pStyle w:val="Ttulo1"/>
       </w:pPr>
-      <w:bookmarkStart w:id="45" w:name="_Toc243510588"/>
+      <w:bookmarkStart w:id="45" w:name="_Toc243510690"/>
       <w:r>
         <w:t>Conclusión</w:t>
       </w:r>
@@ -28380,7 +28380,7 @@
       <w:pPr>
         <w:pStyle w:val="Ttulo2"/>
       </w:pPr>
-      <w:bookmarkStart w:id="46" w:name="_Toc243510589"/>
+      <w:bookmarkStart w:id="46" w:name="_Toc243510691"/>
       <w:r>
         <w:t>Hallazgos sobre planificación y balanceo de carga</w:t>
       </w:r>
@@ -28424,7 +28424,7 @@
       <w:pPr>
         <w:pStyle w:val="Ttulo2"/>
       </w:pPr>
-      <w:bookmarkStart w:id="47" w:name="_Toc243510590"/>
+      <w:bookmarkStart w:id="47" w:name="_Toc243510692"/>
       <w:r>
         <w:t>Respuesta a la pregunta guía</w:t>
       </w:r>
@@ -28479,7 +28479,7 @@
       <w:pPr>
         <w:pStyle w:val="Ttulo2"/>
       </w:pPr>
-      <w:bookmarkStart w:id="48" w:name="_Toc243510591"/>
+      <w:bookmarkStart w:id="48" w:name="_Toc243510693"/>
       <w:r>
         <w:t>Reflexión de cada integrante desde su rol</w:t>
       </w:r>
@@ -28534,7 +28534,7 @@
       <w:pPr>
         <w:pStyle w:val="Ttulo2"/>
       </w:pPr>
-      <w:bookmarkStart w:id="49" w:name="_Toc243510592"/>
+      <w:bookmarkStart w:id="49" w:name="_Toc243510694"/>
       <w:r>
         <w:t>Propuestas para trabajos futuros</w:t>
       </w:r>
@@ -28693,7 +28693,7 @@
       <w:pPr>
         <w:pStyle w:val="Ttulo1"/>
       </w:pPr>
-      <w:bookmarkStart w:id="50" w:name="_Toc243510593"/>
+      <w:bookmarkStart w:id="50" w:name="_Toc243510695"/>
       <w:r>
         <w:lastRenderedPageBreak/>
         <w:t>Referencias</w:t>
@@ -29204,7 +29204,7 @@
       <w:pPr>
         <w:pStyle w:val="Ttulo1"/>
       </w:pPr>
-      <w:bookmarkStart w:id="51" w:name="_Toc243510594"/>
+      <w:bookmarkStart w:id="51" w:name="_Toc243510696"/>
       <w:r>
         <w:lastRenderedPageBreak/>
         <w:t>Anexo A: bitácoras individuales</w:t>
@@ -29233,7 +29233,7 @@
       <w:pPr>
         <w:pStyle w:val="Ttulo2"/>
       </w:pPr>
-      <w:bookmarkStart w:id="52" w:name="_Toc243510595"/>
+      <w:bookmarkStart w:id="52" w:name="_Toc243510697"/>
       <w:r>
         <w:t>Bitácora individual — Salazar, Facundo</w:t>
       </w:r>
@@ -29789,97 +29789,13 @@
     </w:p>
     <w:p>
       <w:pPr>
-        <w:pStyle w:val="Ttulo3"/>
-      </w:pPr>
-      <w:r>
-        <w:t>Reflexión final desde el rol</w:t>
-      </w:r>
-    </w:p>
-    <w:p>
-      <w:pPr>
         <w:ind w:firstLine="720"/>
       </w:pPr>
       <w:r>
         <w:rPr>
-          <w:i/>
-        </w:rPr>
-        <w:t>Completar al cierre del trabajo.</w:t>
-      </w:r>
-    </w:p>
-    <w:p>
-      <w:r>
-        <w:br w:type="page"/>
-      </w:r>
-    </w:p>
-    <w:p>
-      <w:pPr>
-        <w:pStyle w:val="Ttulo2"/>
-      </w:pPr>
-      <w:bookmarkStart w:id="53" w:name="_Toc243510596"/>
-      <w:r>
-        <w:lastRenderedPageBreak/>
-        <w:t>Bitácora individual — Quintana, Sofía</w:t>
-      </w:r>
-      <w:bookmarkEnd w:id="53"/>
-    </w:p>
-    <w:p>
-      <w:pPr>
-        <w:ind w:firstLine="720"/>
-      </w:pPr>
-      <w:r>
-        <w:rPr>
           <w:b/>
         </w:rPr>
-        <w:t>Rol:</w:t>
-      </w:r>
-      <w:r>
-        <w:t xml:space="preserve"> Ingeniero/a de infraestructura como código (Intermedio)</w:t>
-      </w:r>
-    </w:p>
-    <w:p>
-      <w:pPr>
-        <w:ind w:firstLine="720"/>
-      </w:pPr>
-      <w:r>
-        <w:rPr>
-          <w:b/>
-        </w:rPr>
-        <w:t>Entregables propios:</w:t>
-      </w:r>
-      <w:r>
-        <w:t xml:space="preserve"> Vagrantfile, playbooks de Ansible, scripts de emulación de red, tablero de Grafana</w:t>
-      </w:r>
-    </w:p>
-    <w:p>
-      <w:pPr>
-        <w:spacing w:after="160" w:line="276" w:lineRule="auto"/>
-        <w:ind w:left="720"/>
-      </w:pPr>
-      <w:r>
-        <w:rPr>
-          <w:i/>
-          <w:sz w:val="22"/>
-        </w:rPr>
-        <w:t>Completar una entrada por semana, en primera persona y desde el rol. La bitácora es parte de la calificación individual: anotá lo que hiciste de verdad, con fechas, comandos o archivos concretos y lo que aprendiste.</w:t>
-      </w:r>
-    </w:p>
-    <w:p>
-      <w:pPr>
-        <w:pStyle w:val="Ttulo3"/>
-      </w:pPr>
-      <w:r>
-        <w:t>Semana 1 — del ___/___ al ___/___</w:t>
-      </w:r>
-    </w:p>
-    <w:p>
-      <w:pPr>
-        <w:ind w:firstLine="720"/>
-      </w:pPr>
-      <w:r>
-        <w:rPr>
-          <w:b/>
-        </w:rPr>
-        <w:t>Qué hice</w:t>
+        <w:t>Validación y extrapolación (21/10, pasos 6 y 7)</w:t>
       </w:r>
     </w:p>
     <w:p>
@@ -29894,7 +29810,7 @@
       </w:r>
       <w:r>
         <w:tab/>
-        <w:t>☐ Leer el Vagrantfile y entender cómo se generan las máquinas y el inventario de Ansible</w:t>
+        <w:t>Simulé las 18 configuraciones del clúster con las mismas semillas: el makespan simulado se apartó del real un 1,1 % en promedio (máximo 6,8 %) y el orden de las estrategias fue el mismo en las 6 condiciones. La espera media se apartó hasta un 28 %: el modelo no tiene los costos de Python de cada mensaje.</w:t>
       </w:r>
     </w:p>
     <w:p>
@@ -29905,19 +29821,12 @@
         <w:ind w:left="1077" w:hanging="357"/>
       </w:pPr>
       <w:r>
+        <w:lastRenderedPageBreak/>
         <w:t>•</w:t>
       </w:r>
       <w:r>
         <w:tab/>
-        <w:t>☐ Investigación teórica: Vagrant (boxes, proveedores, red privada, licencia BSL 2023) y Ansible (inventario, roles, idempotencia)</w:t>
-      </w:r>
-    </w:p>
-    <w:p>
-      <w:pPr>
-        <w:ind w:left="720"/>
-      </w:pPr>
-      <w:r>
-        <w:t>____________________________________________________________</w:t>
+        <w:t>Extrapolé de 3 a 512 trabajadores (270 simulaciones) y agregué 384, 640 y 768 para ver el codo: el límite del coordinador es su enlace de red, cerca de 490 trabajadores; su CPU nunca pasó del 16 %.</w:t>
       </w:r>
     </w:p>
     <w:p>
@@ -29928,72 +29837,7 @@
         <w:rPr>
           <w:b/>
         </w:rPr>
-        <w:t>Qué aprendí</w:t>
-      </w:r>
-    </w:p>
-    <w:p>
-      <w:pPr>
-        <w:ind w:left="720"/>
-      </w:pPr>
-      <w:r>
-        <w:t>____________________________________________________________</w:t>
-      </w:r>
-    </w:p>
-    <w:p>
-      <w:pPr>
-        <w:ind w:firstLine="720"/>
-      </w:pPr>
-      <w:r>
-        <w:rPr>
-          <w:b/>
-        </w:rPr>
-        <w:t>Dificultades que encontré</w:t>
-      </w:r>
-    </w:p>
-    <w:p>
-      <w:pPr>
-        <w:ind w:left="720"/>
-      </w:pPr>
-      <w:r>
-        <w:t>____________________________________________________________</w:t>
-      </w:r>
-    </w:p>
-    <w:p>
-      <w:pPr>
-        <w:ind w:firstLine="720"/>
-      </w:pPr>
-      <w:r>
-        <w:rPr>
-          <w:b/>
-        </w:rPr>
-        <w:t>Cómo las resolví (o qué quedó pendiente)</w:t>
-      </w:r>
-    </w:p>
-    <w:p>
-      <w:pPr>
-        <w:ind w:left="720"/>
-      </w:pPr>
-      <w:r>
-        <w:t>____________________________________________________________</w:t>
-      </w:r>
-    </w:p>
-    <w:p>
-      <w:pPr>
-        <w:pStyle w:val="Ttulo3"/>
-      </w:pPr>
-      <w:r>
-        <w:t>Semana 2 — del ___/___ al ___/___</w:t>
-      </w:r>
-    </w:p>
-    <w:p>
-      <w:pPr>
-        <w:ind w:firstLine="720"/>
-      </w:pPr>
-      <w:r>
-        <w:rPr>
-          <w:b/>
-        </w:rPr>
-        <w:t>Qué hice</w:t>
+        <w:t>Reproducibilidad (21/10, pasos 1 y 8)</w:t>
       </w:r>
     </w:p>
     <w:p>
@@ -30008,66 +29852,48 @@
       </w:r>
       <w:r>
         <w:tab/>
-        <w:t xml:space="preserve">☐ </w:t>
-      </w:r>
-      <w:r>
-        <w:rPr>
-          <w:b/>
-        </w:rPr>
-        <w:t>Paso 1 en pares con Romina:</w:t>
-      </w:r>
-      <w:r>
-        <w:t xml:space="preserve"> </w:t>
+        <w:t xml:space="preserve">Hice el ciclo </w:t>
       </w:r>
       <w:r>
         <w:rPr>
           <w:rFonts w:ascii="Consolas" w:hAnsi="Consolas"/>
           <w:sz w:val="21"/>
         </w:rPr>
-        <w:t>vagrant up</w:t>
-      </w:r>
-      <w:r>
-        <w:t xml:space="preserve">, </w:t>
+        <w:t>vagrant halt</w:t>
+      </w:r>
+      <w:r>
+        <w:t xml:space="preserve"> / </w:t>
       </w:r>
       <w:r>
         <w:rPr>
           <w:rFonts w:ascii="Consolas" w:hAnsi="Consolas"/>
           <w:sz w:val="21"/>
         </w:rPr>
-        <w:t>vagrant ssh</w:t>
-      </w:r>
-      <w:r>
-        <w:t xml:space="preserve">, </w:t>
+        <w:t>vagrant up</w:t>
+      </w:r>
+      <w:r>
+        <w:t xml:space="preserve"> / </w:t>
       </w:r>
       <w:r>
         <w:rPr>
           <w:rFonts w:ascii="Consolas" w:hAnsi="Consolas"/>
           <w:sz w:val="21"/>
         </w:rPr>
-        <w:t>vagrant halt</w:t>
-      </w:r>
-      <w:r>
-        <w:t xml:space="preserve">, </w:t>
-      </w:r>
-      <w:r>
-        <w:rPr>
-          <w:rFonts w:ascii="Consolas" w:hAnsi="Consolas"/>
-          <w:sz w:val="21"/>
-        </w:rPr>
         <w:t>vagrant destroy -f</w:t>
       </w:r>
       <w:r>
-        <w:t xml:space="preserve"> y nuevo </w:t>
-      </w:r>
-      <w:r>
-        <w:rPr>
-          <w:rFonts w:ascii="Consolas" w:hAnsi="Consolas"/>
-          <w:sz w:val="21"/>
-        </w:rPr>
-        <w:t>vagrant up</w:t>
-      </w:r>
-      <w:r>
-        <w:t xml:space="preserve"> sin intervención</w:t>
+        <w:t xml:space="preserve"> y después cloné el repositorio desde GitHub en otra carpeta y lo levanté siguiendo solo el README: 18,4 minutos, sin intervención. La misma corrida de prueba dio 40,41 s contra 40,50 s de la campaña original, y 40,03 s en SimGrid.</w:t>
+      </w:r>
+    </w:p>
+    <w:p>
+      <w:pPr>
+        <w:ind w:firstLine="720"/>
+      </w:pPr>
+      <w:r>
+        <w:rPr>
+          <w:b/>
+        </w:rPr>
+        <w:t>Qué aprendí</w:t>
       </w:r>
     </w:p>
     <w:p>
@@ -30082,118 +29908,9 @@
       </w:r>
       <w:r>
         <w:tab/>
-        <w:t xml:space="preserve">☐ </w:t>
-      </w:r>
-      <w:r>
-        <w:rPr>
-          <w:b/>
-        </w:rPr>
-        <w:t>Paso 2:</w:t>
-      </w:r>
-      <w:r>
-        <w:t xml:space="preserve"> correr el playbook dos veces (</w:t>
-      </w:r>
-      <w:r>
-        <w:rPr>
-          <w:rFonts w:ascii="Consolas" w:hAnsi="Consolas"/>
-          <w:sz w:val="21"/>
-        </w:rPr>
-        <w:t>vagrant provision coord --provision-with ansible</w:t>
-      </w:r>
-      <w:r>
-        <w:t xml:space="preserve">) y capturar el </w:t>
-      </w:r>
-      <w:r>
-        <w:rPr>
-          <w:rFonts w:ascii="Consolas" w:hAnsi="Consolas"/>
-          <w:sz w:val="21"/>
-        </w:rPr>
-        <w:t>changed=0</w:t>
-      </w:r>
-    </w:p>
-    <w:p>
-      <w:pPr>
-        <w:ind w:left="720"/>
-      </w:pPr>
-      <w:r>
-        <w:lastRenderedPageBreak/>
-        <w:t>____________________________________________________________</w:t>
-      </w:r>
-    </w:p>
-    <w:p>
-      <w:pPr>
-        <w:ind w:firstLine="720"/>
-      </w:pPr>
-      <w:r>
-        <w:rPr>
-          <w:b/>
-        </w:rPr>
-        <w:t>Qué aprendí</w:t>
-      </w:r>
-    </w:p>
-    <w:p>
-      <w:pPr>
-        <w:ind w:left="720"/>
-      </w:pPr>
-      <w:r>
-        <w:t>____________________________________________________________</w:t>
-      </w:r>
-    </w:p>
-    <w:p>
-      <w:pPr>
-        <w:ind w:firstLine="720"/>
-      </w:pPr>
-      <w:r>
-        <w:rPr>
-          <w:b/>
-        </w:rPr>
-        <w:t>Dificultades que encontré</w:t>
-      </w:r>
-    </w:p>
-    <w:p>
-      <w:pPr>
-        <w:ind w:left="720"/>
-      </w:pPr>
-      <w:r>
-        <w:t>____________________________________________________________</w:t>
-      </w:r>
-    </w:p>
-    <w:p>
-      <w:pPr>
-        <w:ind w:firstLine="720"/>
-      </w:pPr>
-      <w:r>
-        <w:rPr>
-          <w:b/>
-        </w:rPr>
-        <w:t>Cómo las resolví (o qué quedó pendiente)</w:t>
-      </w:r>
-    </w:p>
-    <w:p>
-      <w:pPr>
-        <w:ind w:left="720"/>
-      </w:pPr>
-      <w:r>
-        <w:t>____________________________________________________________</w:t>
-      </w:r>
-    </w:p>
-    <w:p>
-      <w:pPr>
-        <w:pStyle w:val="Ttulo3"/>
-      </w:pPr>
-      <w:r>
-        <w:t>Semana 3 — del ___/___ al ___/___</w:t>
-      </w:r>
-    </w:p>
-    <w:p>
-      <w:pPr>
-        <w:ind w:firstLine="720"/>
-      </w:pPr>
-      <w:r>
-        <w:rPr>
-          <w:b/>
-        </w:rPr>
-        <w:t>Qué hice</w:t>
+      </w:r>
+      <w:r>
+        <w:t>Que el simulador se puede usar para decidir (el orden de las estrategias no cambió en ninguna escala) pero no para dar números finos: la espera y el desbalance son las métricas donde más se nota lo que el modelo deja afuera.</w:t>
       </w:r>
     </w:p>
     <w:p>
@@ -30208,24 +29925,102 @@
       </w:r>
       <w:r>
         <w:tab/>
-        <w:t>☐ Aplicar netem a mano (</w:t>
-      </w:r>
-      <w:r>
-        <w:rPr>
-          <w:rFonts w:ascii="Consolas" w:hAnsi="Consolas"/>
-          <w:sz w:val="21"/>
-        </w:rPr>
-        <w:t>sudo lab-netem 20</w:t>
-      </w:r>
-      <w:r>
-        <w:t xml:space="preserve">) y medir con </w:t>
-      </w:r>
-      <w:r>
-        <w:rPr>
-          <w:rFonts w:ascii="Consolas" w:hAnsi="Consolas"/>
-          <w:sz w:val="21"/>
-        </w:rPr>
-        <w:t>ping</w:t>
+        <w:t>Que Grafana, con el tablero refrescándose cada 5 s, llegó a ocupar casi 1 GB del coordinador en dos horas y frenó las simulaciones hasta que lo reinicié.</w:t>
+      </w:r>
+    </w:p>
+    <w:p>
+      <w:pPr>
+        <w:pStyle w:val="Ttulo3"/>
+      </w:pPr>
+      <w:r>
+        <w:t>Reflexión final desde el rol</w:t>
+      </w:r>
+    </w:p>
+    <w:p>
+      <w:pPr>
+        <w:ind w:firstLine="720"/>
+      </w:pPr>
+      <w:r>
+        <w:rPr>
+          <w:i/>
+        </w:rPr>
+        <w:t>Completar al cierre del trabajo.</w:t>
+      </w:r>
+    </w:p>
+    <w:p>
+      <w:r>
+        <w:br w:type="page"/>
+      </w:r>
+    </w:p>
+    <w:p>
+      <w:pPr>
+        <w:pStyle w:val="Ttulo2"/>
+      </w:pPr>
+      <w:bookmarkStart w:id="53" w:name="_Toc243510698"/>
+      <w:r>
+        <w:lastRenderedPageBreak/>
+        <w:t>Bitácora individual — Quintana, Sofía</w:t>
+      </w:r>
+      <w:bookmarkEnd w:id="53"/>
+    </w:p>
+    <w:p>
+      <w:pPr>
+        <w:ind w:firstLine="720"/>
+      </w:pPr>
+      <w:r>
+        <w:rPr>
+          <w:b/>
+        </w:rPr>
+        <w:t>Rol:</w:t>
+      </w:r>
+      <w:r>
+        <w:t xml:space="preserve"> Ingeniero/a de infraestructura como código (Intermedio)</w:t>
+      </w:r>
+    </w:p>
+    <w:p>
+      <w:pPr>
+        <w:ind w:firstLine="720"/>
+      </w:pPr>
+      <w:r>
+        <w:rPr>
+          <w:b/>
+        </w:rPr>
+        <w:t>Entregables propios:</w:t>
+      </w:r>
+      <w:r>
+        <w:t xml:space="preserve"> Vagrantfile, playbooks de Ansible, scripts de emulación de red, tablero de Grafana</w:t>
+      </w:r>
+    </w:p>
+    <w:p>
+      <w:pPr>
+        <w:spacing w:after="160" w:line="276" w:lineRule="auto"/>
+        <w:ind w:left="720"/>
+      </w:pPr>
+      <w:r>
+        <w:rPr>
+          <w:i/>
+          <w:sz w:val="22"/>
+        </w:rPr>
+        <w:t>Completar una entrada por semana, en primera persona y desde el rol. La bitácora es parte de la calificación individual: anotá lo que hiciste de verdad, con fechas, comandos o archivos concretos y lo que aprendiste.</w:t>
+      </w:r>
+    </w:p>
+    <w:p>
+      <w:pPr>
+        <w:pStyle w:val="Ttulo3"/>
+      </w:pPr>
+      <w:r>
+        <w:t>Semana 1 — del ___/___ al ___/___</w:t>
+      </w:r>
+    </w:p>
+    <w:p>
+      <w:pPr>
+        <w:ind w:firstLine="720"/>
+      </w:pPr>
+      <w:r>
+        <w:rPr>
+          <w:b/>
+        </w:rPr>
+        <w:t>Qué hice</w:t>
       </w:r>
     </w:p>
     <w:p>
@@ -30240,17 +30035,7 @@
       </w:r>
       <w:r>
         <w:tab/>
-        <w:t>☐ Revisar Prometheus (</w:t>
-      </w:r>
-      <w:r>
-        <w:rPr>
-          <w:rFonts w:ascii="Consolas" w:hAnsi="Consolas"/>
-          <w:sz w:val="21"/>
-        </w:rPr>
-        <w:t>http://192.168.56.10:9090/targets</w:t>
-      </w:r>
-      <w:r>
-        <w:t>) y el tablero de Grafana durante una corrida</w:t>
+        <w:t>☐ Leer el Vagrantfile y entender cómo se generan las máquinas y el inventario de Ansible</w:t>
       </w:r>
     </w:p>
     <w:p>
@@ -30265,7 +30050,7 @@
       </w:r>
       <w:r>
         <w:tab/>
-        <w:t>☐ Supervisar las corridas de Romina (paso 5)</w:t>
+        <w:t>☐ Investigación teórica: Vagrant (boxes, proveedores, red privada, licencia BSL 2023) y Ansible (inventario, roles, idempotencia)</w:t>
       </w:r>
     </w:p>
     <w:p>
@@ -30338,7 +30123,7 @@
         <w:pStyle w:val="Ttulo3"/>
       </w:pPr>
       <w:r>
-        <w:t>Semana 4 — del ___/___ al ___/___</w:t>
+        <w:t>Semana 2 — del ___/___ al ___/___</w:t>
       </w:r>
     </w:p>
     <w:p>
@@ -30364,7 +30149,66 @@
       </w:r>
       <w:r>
         <w:tab/>
-        <w:t>☐ Redactar la sección de infraestructura del informe</w:t>
+        <w:t xml:space="preserve">☐ </w:t>
+      </w:r>
+      <w:r>
+        <w:rPr>
+          <w:b/>
+        </w:rPr>
+        <w:t>Paso 1 en pares con Romina:</w:t>
+      </w:r>
+      <w:r>
+        <w:t xml:space="preserve"> </w:t>
+      </w:r>
+      <w:r>
+        <w:rPr>
+          <w:rFonts w:ascii="Consolas" w:hAnsi="Consolas"/>
+          <w:sz w:val="21"/>
+        </w:rPr>
+        <w:t>vagrant up</w:t>
+      </w:r>
+      <w:r>
+        <w:t xml:space="preserve">, </w:t>
+      </w:r>
+      <w:r>
+        <w:rPr>
+          <w:rFonts w:ascii="Consolas" w:hAnsi="Consolas"/>
+          <w:sz w:val="21"/>
+        </w:rPr>
+        <w:t>vagrant ssh</w:t>
+      </w:r>
+      <w:r>
+        <w:t xml:space="preserve">, </w:t>
+      </w:r>
+      <w:r>
+        <w:rPr>
+          <w:rFonts w:ascii="Consolas" w:hAnsi="Consolas"/>
+          <w:sz w:val="21"/>
+        </w:rPr>
+        <w:t>vagrant halt</w:t>
+      </w:r>
+      <w:r>
+        <w:t xml:space="preserve">, </w:t>
+      </w:r>
+      <w:r>
+        <w:rPr>
+          <w:rFonts w:ascii="Consolas" w:hAnsi="Consolas"/>
+          <w:sz w:val="21"/>
+        </w:rPr>
+        <w:t>vagrant destroy -f</w:t>
+      </w:r>
+      <w:r>
+        <w:t xml:space="preserve"> y nuevo </w:t>
+      </w:r>
+      <w:r>
+        <w:rPr>
+          <w:rFonts w:ascii="Consolas" w:hAnsi="Consolas"/>
+          <w:sz w:val="21"/>
+        </w:rPr>
+        <w:t>vagrant up</w:t>
+      </w:r>
+      <w:r>
+        <w:t xml:space="preserve"> sin intervención</w:t>
       </w:r>
     </w:p>
     <w:p>
@@ -30379,7 +30223,33 @@
       </w:r>
       <w:r>
         <w:tab/>
-        <w:t>☐ Preparar la parte de la defensa: Vagrantfile, Ansible, netem, monitoreo</w:t>
+        <w:t xml:space="preserve">☐ </w:t>
+      </w:r>
+      <w:r>
+        <w:rPr>
+          <w:b/>
+        </w:rPr>
+        <w:t>Paso 2:</w:t>
+      </w:r>
+      <w:r>
+        <w:t xml:space="preserve"> correr el playbook dos veces (</w:t>
+      </w:r>
+      <w:r>
+        <w:rPr>
+          <w:rFonts w:ascii="Consolas" w:hAnsi="Consolas"/>
+          <w:sz w:val="21"/>
+        </w:rPr>
+        <w:t>vagrant provision coord --provision-with ansible</w:t>
+      </w:r>
+      <w:r>
+        <w:t xml:space="preserve">) y capturar el </w:t>
+      </w:r>
+      <w:r>
+        <w:rPr>
+          <w:rFonts w:ascii="Consolas" w:hAnsi="Consolas"/>
+          <w:sz w:val="21"/>
+        </w:rPr>
+        <w:t>changed=0</w:t>
       </w:r>
     </w:p>
     <w:p>
@@ -30387,6 +30257,7 @@
         <w:ind w:left="720"/>
       </w:pPr>
       <w:r>
+        <w:lastRenderedPageBreak/>
         <w:t>____________________________________________________________</w:t>
       </w:r>
     </w:p>
@@ -30398,7 +30269,6 @@
         <w:rPr>
           <w:b/>
         </w:rPr>
-        <w:lastRenderedPageBreak/>
         <w:t>Qué aprendí</w:t>
       </w:r>
     </w:p>
@@ -30453,83 +30323,7 @@
         <w:pStyle w:val="Ttulo3"/>
       </w:pPr>
       <w:r>
-        <w:t>Reflexión final desde el rol</w:t>
-      </w:r>
-    </w:p>
-    <w:p>
-      <w:pPr>
-        <w:ind w:firstLine="720"/>
-      </w:pPr>
-      <w:r>
-        <w:rPr>
-          <w:i/>
-        </w:rPr>
-        <w:t>¿Qué aprendí sobre sistemas distribuidos a partir de mi rol? ¿Qué haría distinto? ¿Qué parte de otro rol entendí mejor gracias al trabajo en pares?</w:t>
-      </w:r>
-    </w:p>
-    <w:p>
-      <w:r>
-        <w:br w:type="page"/>
-      </w:r>
-    </w:p>
-    <w:p>
-      <w:pPr>
-        <w:pStyle w:val="Ttulo2"/>
-      </w:pPr>
-      <w:bookmarkStart w:id="54" w:name="_Toc243510597"/>
-      <w:r>
-        <w:lastRenderedPageBreak/>
-        <w:t>Bitácora individual — Vera, Romina</w:t>
-      </w:r>
-      <w:bookmarkEnd w:id="54"/>
-    </w:p>
-    <w:p>
-      <w:pPr>
-        <w:ind w:firstLine="720"/>
-      </w:pPr>
-      <w:r>
-        <w:rPr>
-          <w:b/>
-        </w:rPr>
-        <w:t>Rol:</w:t>
-      </w:r>
-      <w:r>
-        <w:t xml:space="preserve"> Analista de experimentación y datos (Inicial)</w:t>
-      </w:r>
-    </w:p>
-    <w:p>
-      <w:pPr>
-        <w:ind w:firstLine="720"/>
-      </w:pPr>
-      <w:r>
-        <w:rPr>
-          <w:b/>
-        </w:rPr>
-        <w:t>Entregables propios:</w:t>
-      </w:r>
-      <w:r>
-        <w:t xml:space="preserve"> planilla de corridas, cuaderno Jupyter, README de reproducción, prueba de reproducibilidad</w:t>
-      </w:r>
-    </w:p>
-    <w:p>
-      <w:pPr>
-        <w:spacing w:after="160" w:line="276" w:lineRule="auto"/>
-        <w:ind w:left="720"/>
-      </w:pPr>
-      <w:r>
-        <w:rPr>
-          <w:i/>
-          <w:sz w:val="22"/>
-        </w:rPr>
-        <w:t>Completar una entrada por semana, en primera persona y desde el rol. La bitácora es parte de la calificación individual: anotá lo que hiciste de verdad, con fechas, comandos o archivos concretos y lo que aprendiste.</w:t>
-      </w:r>
-    </w:p>
-    <w:p>
-      <w:pPr>
-        <w:pStyle w:val="Ttulo3"/>
-      </w:pPr>
-      <w:r>
-        <w:t>Semana 1 — del ___/___ al ___/___</w:t>
+        <w:t>Semana 3 — del ___/___ al ___/___</w:t>
       </w:r>
     </w:p>
     <w:p>
@@ -30555,17 +30349,24 @@
       </w:r>
       <w:r>
         <w:tab/>
-        <w:t>☐ Leer la planilla de corridas (</w:t>
+        <w:t>☐ Aplicar netem a mano (</w:t>
       </w:r>
       <w:r>
         <w:rPr>
           <w:rFonts w:ascii="Consolas" w:hAnsi="Consolas"/>
           <w:sz w:val="21"/>
         </w:rPr>
-        <w:t>experiments/planilla.csv</w:t>
-      </w:r>
-      <w:r>
-        <w:t>) y entender factores, niveles y repeticiones</w:t>
+        <w:t>sudo lab-netem 20</w:t>
+      </w:r>
+      <w:r>
+        <w:t xml:space="preserve">) y medir con </w:t>
+      </w:r>
+      <w:r>
+        <w:rPr>
+          <w:rFonts w:ascii="Consolas" w:hAnsi="Consolas"/>
+          <w:sz w:val="21"/>
+        </w:rPr>
+        <w:t>ping</w:t>
       </w:r>
     </w:p>
     <w:p>
@@ -30580,91 +30381,17 @@
       </w:r>
       <w:r>
         <w:tab/>
-        <w:t>☐ Investigación teórica: diseño de experimentos e intervalos de confianza (Jain, 1991)</w:t>
-      </w:r>
-    </w:p>
-    <w:p>
-      <w:pPr>
-        <w:ind w:left="720"/>
-      </w:pPr>
-      <w:r>
-        <w:t>____________________________________________________________</w:t>
-      </w:r>
-    </w:p>
-    <w:p>
-      <w:pPr>
-        <w:ind w:firstLine="720"/>
-      </w:pPr>
-      <w:r>
-        <w:rPr>
-          <w:b/>
-        </w:rPr>
-        <w:t>Qué aprendí</w:t>
-      </w:r>
-    </w:p>
-    <w:p>
-      <w:pPr>
-        <w:ind w:left="720"/>
-      </w:pPr>
-      <w:r>
-        <w:t>____________________________________________________________</w:t>
-      </w:r>
-    </w:p>
-    <w:p>
-      <w:pPr>
-        <w:ind w:firstLine="720"/>
-      </w:pPr>
-      <w:r>
-        <w:rPr>
-          <w:b/>
-        </w:rPr>
-        <w:t>Dificultades que encontré</w:t>
-      </w:r>
-    </w:p>
-    <w:p>
-      <w:pPr>
-        <w:ind w:left="720"/>
-      </w:pPr>
-      <w:r>
-        <w:t>____________________________________________________________</w:t>
-      </w:r>
-    </w:p>
-    <w:p>
-      <w:pPr>
-        <w:ind w:firstLine="720"/>
-      </w:pPr>
-      <w:r>
-        <w:rPr>
-          <w:b/>
-        </w:rPr>
-        <w:t>Cómo las resolví (o qué quedó pendiente)</w:t>
-      </w:r>
-    </w:p>
-    <w:p>
-      <w:pPr>
-        <w:ind w:left="720"/>
-      </w:pPr>
-      <w:r>
-        <w:t>____________________________________________________________</w:t>
-      </w:r>
-    </w:p>
-    <w:p>
-      <w:pPr>
-        <w:pStyle w:val="Ttulo3"/>
-      </w:pPr>
-      <w:r>
-        <w:t>Semana 2 — del ___/___ al ___/___</w:t>
-      </w:r>
-    </w:p>
-    <w:p>
-      <w:pPr>
-        <w:ind w:firstLine="720"/>
-      </w:pPr>
-      <w:r>
-        <w:rPr>
-          <w:b/>
-        </w:rPr>
-        <w:t>Qué hice</w:t>
+        <w:t>☐ Revisar Prometheus (</w:t>
+      </w:r>
+      <w:r>
+        <w:rPr>
+          <w:rFonts w:ascii="Consolas" w:hAnsi="Consolas"/>
+          <w:sz w:val="21"/>
+        </w:rPr>
+        <w:t>http://192.168.56.10:9090/targets</w:t>
+      </w:r>
+      <w:r>
+        <w:t>) y el tablero de Grafana durante una corrida</w:t>
       </w:r>
     </w:p>
     <w:p>
@@ -30679,16 +30406,91 @@
       </w:r>
       <w:r>
         <w:tab/>
-        <w:t xml:space="preserve">☐ </w:t>
-      </w:r>
+        <w:t>☐ Supervisar las corridas de Romina (paso 5)</w:t>
+      </w:r>
+    </w:p>
+    <w:p>
+      <w:pPr>
+        <w:ind w:left="720"/>
+      </w:pPr>
+      <w:r>
+        <w:t>____________________________________________________________</w:t>
+      </w:r>
+    </w:p>
+    <w:p>
+      <w:pPr>
+        <w:ind w:firstLine="720"/>
+      </w:pPr>
       <w:r>
         <w:rPr>
           <w:b/>
         </w:rPr>
-        <w:t>Paso 1 en pares con Sofía:</w:t>
-      </w:r>
-      <w:r>
-        <w:t xml:space="preserve"> primera puesta en marcha del clúster</w:t>
+        <w:t>Qué aprendí</w:t>
+      </w:r>
+    </w:p>
+    <w:p>
+      <w:pPr>
+        <w:ind w:left="720"/>
+      </w:pPr>
+      <w:r>
+        <w:t>____________________________________________________________</w:t>
+      </w:r>
+    </w:p>
+    <w:p>
+      <w:pPr>
+        <w:ind w:firstLine="720"/>
+      </w:pPr>
+      <w:r>
+        <w:rPr>
+          <w:b/>
+        </w:rPr>
+        <w:t>Dificultades que encontré</w:t>
+      </w:r>
+    </w:p>
+    <w:p>
+      <w:pPr>
+        <w:ind w:left="720"/>
+      </w:pPr>
+      <w:r>
+        <w:t>____________________________________________________________</w:t>
+      </w:r>
+    </w:p>
+    <w:p>
+      <w:pPr>
+        <w:ind w:firstLine="720"/>
+      </w:pPr>
+      <w:r>
+        <w:rPr>
+          <w:b/>
+        </w:rPr>
+        <w:t>Cómo las resolví (o qué quedó pendiente)</w:t>
+      </w:r>
+    </w:p>
+    <w:p>
+      <w:pPr>
+        <w:ind w:left="720"/>
+      </w:pPr>
+      <w:r>
+        <w:t>____________________________________________________________</w:t>
+      </w:r>
+    </w:p>
+    <w:p>
+      <w:pPr>
+        <w:pStyle w:val="Ttulo3"/>
+      </w:pPr>
+      <w:r>
+        <w:t>Semana 4 — del ___/___ al ___/___</w:t>
+      </w:r>
+    </w:p>
+    <w:p>
+      <w:pPr>
+        <w:ind w:firstLine="720"/>
+      </w:pPr>
+      <w:r>
+        <w:rPr>
+          <w:b/>
+        </w:rPr>
+        <w:t>Qué hice</w:t>
       </w:r>
     </w:p>
     <w:p>
@@ -30703,102 +30505,7 @@
       </w:r>
       <w:r>
         <w:tab/>
-        <w:t xml:space="preserve">☐ Cambiar un parámetro simple con guía (por ejemplo </w:t>
-      </w:r>
-      <w:r>
-        <w:rPr>
-          <w:rFonts w:ascii="Consolas" w:hAnsi="Consolas"/>
-          <w:sz w:val="21"/>
-        </w:rPr>
-        <w:t>N_WORKERS=2 vagrant up</w:t>
-      </w:r>
-      <w:r>
-        <w:t xml:space="preserve"> o la memoria de un trabajador) y anotar qué pasó</w:t>
-      </w:r>
-    </w:p>
-    <w:p>
-      <w:pPr>
-        <w:ind w:left="720"/>
-      </w:pPr>
-      <w:r>
-        <w:t>____________________________________________________________</w:t>
-      </w:r>
-    </w:p>
-    <w:p>
-      <w:pPr>
-        <w:ind w:firstLine="720"/>
-      </w:pPr>
-      <w:r>
-        <w:rPr>
-          <w:b/>
-        </w:rPr>
-        <w:lastRenderedPageBreak/>
-        <w:t>Qué aprendí</w:t>
-      </w:r>
-    </w:p>
-    <w:p>
-      <w:pPr>
-        <w:ind w:left="720"/>
-      </w:pPr>
-      <w:r>
-        <w:t>____________________________________________________________</w:t>
-      </w:r>
-    </w:p>
-    <w:p>
-      <w:pPr>
-        <w:ind w:firstLine="720"/>
-      </w:pPr>
-      <w:r>
-        <w:rPr>
-          <w:b/>
-        </w:rPr>
-        <w:t>Dificultades que encontré</w:t>
-      </w:r>
-    </w:p>
-    <w:p>
-      <w:pPr>
-        <w:ind w:left="720"/>
-      </w:pPr>
-      <w:r>
-        <w:t>____________________________________________________________</w:t>
-      </w:r>
-    </w:p>
-    <w:p>
-      <w:pPr>
-        <w:ind w:firstLine="720"/>
-      </w:pPr>
-      <w:r>
-        <w:rPr>
-          <w:b/>
-        </w:rPr>
-        <w:t>Cómo las resolví (o qué quedó pendiente)</w:t>
-      </w:r>
-    </w:p>
-    <w:p>
-      <w:pPr>
-        <w:ind w:left="720"/>
-      </w:pPr>
-      <w:r>
-        <w:t>____________________________________________________________</w:t>
-      </w:r>
-    </w:p>
-    <w:p>
-      <w:pPr>
-        <w:pStyle w:val="Ttulo3"/>
-      </w:pPr>
-      <w:r>
-        <w:t>Semana 3 — del ___/___ al ___/___</w:t>
-      </w:r>
-    </w:p>
-    <w:p>
-      <w:pPr>
-        <w:ind w:firstLine="720"/>
-      </w:pPr>
-      <w:r>
-        <w:rPr>
-          <w:b/>
-        </w:rPr>
-        <w:t>Qué hice</w:t>
+        <w:t>☐ Redactar la sección de infraestructura del informe</w:t>
       </w:r>
     </w:p>
     <w:p>
@@ -30813,26 +30520,168 @@
       </w:r>
       <w:r>
         <w:tab/>
-        <w:t xml:space="preserve">☐ </w:t>
-      </w:r>
+        <w:t>☐ Preparar la parte de la defensa: Vagrantfile, Ansible, netem, monitoreo</w:t>
+      </w:r>
+    </w:p>
+    <w:p>
+      <w:pPr>
+        <w:ind w:left="720"/>
+      </w:pPr>
+      <w:r>
+        <w:t>____________________________________________________________</w:t>
+      </w:r>
+    </w:p>
+    <w:p>
+      <w:pPr>
+        <w:ind w:firstLine="720"/>
+      </w:pPr>
       <w:r>
         <w:rPr>
           <w:b/>
         </w:rPr>
-        <w:t>Paso 5:</w:t>
-      </w:r>
-      <w:r>
-        <w:t xml:space="preserve"> ejecutar el protocolo (</w:t>
-      </w:r>
-      <w:r>
-        <w:rPr>
-          <w:rFonts w:ascii="Consolas" w:hAnsi="Consolas"/>
-          <w:sz w:val="21"/>
-        </w:rPr>
-        <w:t>agrolab run</w:t>
-      </w:r>
-      <w:r>
-        <w:t>) siguiendo la planilla y anotar observaciones de cada bloque</w:t>
+        <w:lastRenderedPageBreak/>
+        <w:t>Qué aprendí</w:t>
+      </w:r>
+    </w:p>
+    <w:p>
+      <w:pPr>
+        <w:ind w:left="720"/>
+      </w:pPr>
+      <w:r>
+        <w:t>____________________________________________________________</w:t>
+      </w:r>
+    </w:p>
+    <w:p>
+      <w:pPr>
+        <w:ind w:firstLine="720"/>
+      </w:pPr>
+      <w:r>
+        <w:rPr>
+          <w:b/>
+        </w:rPr>
+        <w:t>Dificultades que encontré</w:t>
+      </w:r>
+    </w:p>
+    <w:p>
+      <w:pPr>
+        <w:ind w:left="720"/>
+      </w:pPr>
+      <w:r>
+        <w:t>____________________________________________________________</w:t>
+      </w:r>
+    </w:p>
+    <w:p>
+      <w:pPr>
+        <w:ind w:firstLine="720"/>
+      </w:pPr>
+      <w:r>
+        <w:rPr>
+          <w:b/>
+        </w:rPr>
+        <w:t>Cómo las resolví (o qué quedó pendiente)</w:t>
+      </w:r>
+    </w:p>
+    <w:p>
+      <w:pPr>
+        <w:ind w:left="720"/>
+      </w:pPr>
+      <w:r>
+        <w:t>____________________________________________________________</w:t>
+      </w:r>
+    </w:p>
+    <w:p>
+      <w:pPr>
+        <w:pStyle w:val="Ttulo3"/>
+      </w:pPr>
+      <w:r>
+        <w:t>Reflexión final desde el rol</w:t>
+      </w:r>
+    </w:p>
+    <w:p>
+      <w:pPr>
+        <w:ind w:firstLine="720"/>
+      </w:pPr>
+      <w:r>
+        <w:rPr>
+          <w:i/>
+        </w:rPr>
+        <w:t>¿Qué aprendí sobre sistemas distribuidos a partir de mi rol? ¿Qué haría distinto? ¿Qué parte de otro rol entendí mejor gracias al trabajo en pares?</w:t>
+      </w:r>
+    </w:p>
+    <w:p>
+      <w:r>
+        <w:br w:type="page"/>
+      </w:r>
+    </w:p>
+    <w:p>
+      <w:pPr>
+        <w:pStyle w:val="Ttulo2"/>
+      </w:pPr>
+      <w:bookmarkStart w:id="54" w:name="_Toc243510699"/>
+      <w:r>
+        <w:lastRenderedPageBreak/>
+        <w:t>Bitácora individual — Vera, Romina</w:t>
+      </w:r>
+      <w:bookmarkEnd w:id="54"/>
+    </w:p>
+    <w:p>
+      <w:pPr>
+        <w:ind w:firstLine="720"/>
+      </w:pPr>
+      <w:r>
+        <w:rPr>
+          <w:b/>
+        </w:rPr>
+        <w:t>Rol:</w:t>
+      </w:r>
+      <w:r>
+        <w:t xml:space="preserve"> Analista de experimentación y datos (Inicial)</w:t>
+      </w:r>
+    </w:p>
+    <w:p>
+      <w:pPr>
+        <w:ind w:firstLine="720"/>
+      </w:pPr>
+      <w:r>
+        <w:rPr>
+          <w:b/>
+        </w:rPr>
+        <w:t>Entregables propios:</w:t>
+      </w:r>
+      <w:r>
+        <w:t xml:space="preserve"> planilla de corridas, cuaderno Jupyter, README de reproducción, prueba de reproducibilidad</w:t>
+      </w:r>
+    </w:p>
+    <w:p>
+      <w:pPr>
+        <w:spacing w:after="160" w:line="276" w:lineRule="auto"/>
+        <w:ind w:left="720"/>
+      </w:pPr>
+      <w:r>
+        <w:rPr>
+          <w:i/>
+          <w:sz w:val="22"/>
+        </w:rPr>
+        <w:t>Completar una entrada por semana, en primera persona y desde el rol. La bitácora es parte de la calificación individual: anotá lo que hiciste de verdad, con fechas, comandos o archivos concretos y lo que aprendiste.</w:t>
+      </w:r>
+    </w:p>
+    <w:p>
+      <w:pPr>
+        <w:pStyle w:val="Ttulo3"/>
+      </w:pPr>
+      <w:r>
+        <w:t>Semana 1 — del ___/___ al ___/___</w:t>
+      </w:r>
+    </w:p>
+    <w:p>
+      <w:pPr>
+        <w:ind w:firstLine="720"/>
+      </w:pPr>
+      <w:r>
+        <w:rPr>
+          <w:b/>
+        </w:rPr>
+        <w:t>Qué hice</w:t>
       </w:r>
     </w:p>
     <w:p>
@@ -30847,110 +30696,17 @@
       </w:r>
       <w:r>
         <w:tab/>
-        <w:t xml:space="preserve">☐ </w:t>
-      </w:r>
-      <w:r>
-        <w:rPr>
-          <w:b/>
-        </w:rPr>
-        <w:t>Paso 6 en pares con Facundo:</w:t>
-      </w:r>
-      <w:r>
-        <w:t xml:space="preserve"> calibración del simulador (</w:t>
+        <w:t>☐ Leer la planilla de corridas (</w:t>
       </w:r>
       <w:r>
         <w:rPr>
           <w:rFonts w:ascii="Consolas" w:hAnsi="Consolas"/>
           <w:sz w:val="21"/>
         </w:rPr>
-        <w:t>agrolab calibrate</w:t>
-      </w:r>
-      <w:r>
-        <w:t>)</w:t>
-      </w:r>
-    </w:p>
-    <w:p>
-      <w:pPr>
-        <w:ind w:left="720"/>
-      </w:pPr>
-      <w:r>
-        <w:t>____________________________________________________________</w:t>
-      </w:r>
-    </w:p>
-    <w:p>
-      <w:pPr>
-        <w:ind w:firstLine="720"/>
-      </w:pPr>
-      <w:r>
-        <w:rPr>
-          <w:b/>
-        </w:rPr>
-        <w:t>Qué aprendí</w:t>
-      </w:r>
-    </w:p>
-    <w:p>
-      <w:pPr>
-        <w:ind w:left="720"/>
-      </w:pPr>
-      <w:r>
-        <w:t>____________________________________________________________</w:t>
-      </w:r>
-    </w:p>
-    <w:p>
-      <w:pPr>
-        <w:ind w:firstLine="720"/>
-      </w:pPr>
-      <w:r>
-        <w:rPr>
-          <w:b/>
-        </w:rPr>
-        <w:t>Dificultades que encontré</w:t>
-      </w:r>
-    </w:p>
-    <w:p>
-      <w:pPr>
-        <w:ind w:left="720"/>
-      </w:pPr>
-      <w:r>
-        <w:t>____________________________________________________________</w:t>
-      </w:r>
-    </w:p>
-    <w:p>
-      <w:pPr>
-        <w:ind w:firstLine="720"/>
-      </w:pPr>
-      <w:r>
-        <w:rPr>
-          <w:b/>
-        </w:rPr>
-        <w:t>Cómo las resolví (o qué quedó pendiente)</w:t>
-      </w:r>
-    </w:p>
-    <w:p>
-      <w:pPr>
-        <w:ind w:left="720"/>
-      </w:pPr>
-      <w:r>
-        <w:t>____________________________________________________________</w:t>
-      </w:r>
-    </w:p>
-    <w:p>
-      <w:pPr>
-        <w:pStyle w:val="Ttulo3"/>
-      </w:pPr>
-      <w:r>
-        <w:t>Semana 4 — del ___/___ al ___/___</w:t>
-      </w:r>
-    </w:p>
-    <w:p>
-      <w:pPr>
-        <w:ind w:firstLine="720"/>
-      </w:pPr>
-      <w:r>
-        <w:rPr>
-          <w:b/>
-        </w:rPr>
-        <w:t>Qué hice</w:t>
+        <w:t>experiments/planilla.csv</w:t>
+      </w:r>
+      <w:r>
+        <w:t>) y entender factores, niveles y repeticiones</w:t>
       </w:r>
     </w:p>
     <w:p>
@@ -30965,17 +30721,91 @@
       </w:r>
       <w:r>
         <w:tab/>
-        <w:t xml:space="preserve">☐ Cuaderno Jupyter: correr </w:t>
-      </w:r>
-      <w:r>
-        <w:rPr>
-          <w:rFonts w:ascii="Consolas" w:hAnsi="Consolas"/>
-          <w:sz w:val="21"/>
-        </w:rPr>
-        <w:t>analysis/analisis.ipynb</w:t>
-      </w:r>
-      <w:r>
-        <w:t>, revisar tablas y gráficos</w:t>
+        <w:t>☐ Investigación teórica: diseño de experimentos e intervalos de confianza (Jain, 1991)</w:t>
+      </w:r>
+    </w:p>
+    <w:p>
+      <w:pPr>
+        <w:ind w:left="720"/>
+      </w:pPr>
+      <w:r>
+        <w:t>____________________________________________________________</w:t>
+      </w:r>
+    </w:p>
+    <w:p>
+      <w:pPr>
+        <w:ind w:firstLine="720"/>
+      </w:pPr>
+      <w:r>
+        <w:rPr>
+          <w:b/>
+        </w:rPr>
+        <w:t>Qué aprendí</w:t>
+      </w:r>
+    </w:p>
+    <w:p>
+      <w:pPr>
+        <w:ind w:left="720"/>
+      </w:pPr>
+      <w:r>
+        <w:t>____________________________________________________________</w:t>
+      </w:r>
+    </w:p>
+    <w:p>
+      <w:pPr>
+        <w:ind w:firstLine="720"/>
+      </w:pPr>
+      <w:r>
+        <w:rPr>
+          <w:b/>
+        </w:rPr>
+        <w:t>Dificultades que encontré</w:t>
+      </w:r>
+    </w:p>
+    <w:p>
+      <w:pPr>
+        <w:ind w:left="720"/>
+      </w:pPr>
+      <w:r>
+        <w:t>____________________________________________________________</w:t>
+      </w:r>
+    </w:p>
+    <w:p>
+      <w:pPr>
+        <w:ind w:firstLine="720"/>
+      </w:pPr>
+      <w:r>
+        <w:rPr>
+          <w:b/>
+        </w:rPr>
+        <w:t>Cómo las resolví (o qué quedó pendiente)</w:t>
+      </w:r>
+    </w:p>
+    <w:p>
+      <w:pPr>
+        <w:ind w:left="720"/>
+      </w:pPr>
+      <w:r>
+        <w:t>____________________________________________________________</w:t>
+      </w:r>
+    </w:p>
+    <w:p>
+      <w:pPr>
+        <w:pStyle w:val="Ttulo3"/>
+      </w:pPr>
+      <w:r>
+        <w:t>Semana 2 — del ___/___ al ___/___</w:t>
+      </w:r>
+    </w:p>
+    <w:p>
+      <w:pPr>
+        <w:ind w:firstLine="720"/>
+      </w:pPr>
+      <w:r>
+        <w:rPr>
+          <w:b/>
+        </w:rPr>
+        <w:t>Qué hice</w:t>
       </w:r>
     </w:p>
     <w:p>
@@ -30996,10 +30826,37 @@
         <w:rPr>
           <w:b/>
         </w:rPr>
-        <w:t>Paso 8:</w:t>
-      </w:r>
-      <w:r>
-        <w:t xml:space="preserve"> clonar el repositorio en una computadora que no participó y seguir solo el README; anotar cada paso que falló y cómo se corrigió</w:t>
+        <w:t>Paso 1 en pares con Sofía:</w:t>
+      </w:r>
+      <w:r>
+        <w:t xml:space="preserve"> primera puesta en marcha del clúster</w:t>
+      </w:r>
+    </w:p>
+    <w:p>
+      <w:pPr>
+        <w:tabs>
+          <w:tab w:val="left" w:pos="1077"/>
+        </w:tabs>
+        <w:ind w:left="1077" w:hanging="357"/>
+      </w:pPr>
+      <w:r>
+        <w:t>•</w:t>
+      </w:r>
+      <w:r>
+        <w:tab/>
+      </w:r>
+      <w:r>
+        <w:t xml:space="preserve">☐ Cambiar un parámetro simple con guía (por ejemplo </w:t>
+      </w:r>
+      <w:r>
+        <w:rPr>
+          <w:rFonts w:ascii="Consolas" w:hAnsi="Consolas"/>
+          <w:sz w:val="21"/>
+        </w:rPr>
+        <w:t>N_WORKERS=2 vagrant up</w:t>
+      </w:r>
+      <w:r>
+        <w:t xml:space="preserve"> o la memoria de un trabajador) y anotar qué pasó</w:t>
       </w:r>
     </w:p>
     <w:p>
@@ -31073,6 +30930,292 @@
         <w:pStyle w:val="Ttulo3"/>
       </w:pPr>
       <w:r>
+        <w:t>Semana 3 — del ___/___ al ___/___</w:t>
+      </w:r>
+    </w:p>
+    <w:p>
+      <w:pPr>
+        <w:ind w:firstLine="720"/>
+      </w:pPr>
+      <w:r>
+        <w:rPr>
+          <w:b/>
+        </w:rPr>
+        <w:t>Qué hice</w:t>
+      </w:r>
+    </w:p>
+    <w:p>
+      <w:pPr>
+        <w:tabs>
+          <w:tab w:val="left" w:pos="1077"/>
+        </w:tabs>
+        <w:ind w:left="1077" w:hanging="357"/>
+      </w:pPr>
+      <w:r>
+        <w:t>•</w:t>
+      </w:r>
+      <w:r>
+        <w:tab/>
+        <w:t xml:space="preserve">☐ </w:t>
+      </w:r>
+      <w:r>
+        <w:rPr>
+          <w:b/>
+        </w:rPr>
+        <w:t>Paso 5:</w:t>
+      </w:r>
+      <w:r>
+        <w:t xml:space="preserve"> ejecutar el protocolo (</w:t>
+      </w:r>
+      <w:r>
+        <w:rPr>
+          <w:rFonts w:ascii="Consolas" w:hAnsi="Consolas"/>
+          <w:sz w:val="21"/>
+        </w:rPr>
+        <w:t>agrolab run</w:t>
+      </w:r>
+      <w:r>
+        <w:t>) siguiendo la planilla y anotar observaciones de cada bloque</w:t>
+      </w:r>
+    </w:p>
+    <w:p>
+      <w:pPr>
+        <w:tabs>
+          <w:tab w:val="left" w:pos="1077"/>
+        </w:tabs>
+        <w:ind w:left="1077" w:hanging="357"/>
+      </w:pPr>
+      <w:r>
+        <w:t>•</w:t>
+      </w:r>
+      <w:r>
+        <w:tab/>
+        <w:t xml:space="preserve">☐ </w:t>
+      </w:r>
+      <w:r>
+        <w:rPr>
+          <w:b/>
+        </w:rPr>
+        <w:t>Paso 6 en pares con Facundo:</w:t>
+      </w:r>
+      <w:r>
+        <w:t xml:space="preserve"> calibración del simulador (</w:t>
+      </w:r>
+      <w:r>
+        <w:rPr>
+          <w:rFonts w:ascii="Consolas" w:hAnsi="Consolas"/>
+          <w:sz w:val="21"/>
+        </w:rPr>
+        <w:t>agrolab calibrate</w:t>
+      </w:r>
+      <w:r>
+        <w:t>)</w:t>
+      </w:r>
+    </w:p>
+    <w:p>
+      <w:pPr>
+        <w:ind w:left="720"/>
+      </w:pPr>
+      <w:r>
+        <w:t>____________________________________________________________</w:t>
+      </w:r>
+    </w:p>
+    <w:p>
+      <w:pPr>
+        <w:ind w:firstLine="720"/>
+      </w:pPr>
+      <w:r>
+        <w:rPr>
+          <w:b/>
+        </w:rPr>
+        <w:t>Qué aprendí</w:t>
+      </w:r>
+    </w:p>
+    <w:p>
+      <w:pPr>
+        <w:ind w:left="720"/>
+      </w:pPr>
+      <w:r>
+        <w:t>____________________________________________________________</w:t>
+      </w:r>
+    </w:p>
+    <w:p>
+      <w:pPr>
+        <w:ind w:firstLine="720"/>
+      </w:pPr>
+      <w:r>
+        <w:rPr>
+          <w:b/>
+        </w:rPr>
+        <w:t>Dificultades que encontré</w:t>
+      </w:r>
+    </w:p>
+    <w:p>
+      <w:pPr>
+        <w:ind w:left="720"/>
+      </w:pPr>
+      <w:r>
+        <w:t>____________________________________________________________</w:t>
+      </w:r>
+    </w:p>
+    <w:p>
+      <w:pPr>
+        <w:ind w:firstLine="720"/>
+      </w:pPr>
+      <w:r>
+        <w:rPr>
+          <w:b/>
+        </w:rPr>
+        <w:t>Cómo las resolví (o qué quedó pendiente)</w:t>
+      </w:r>
+    </w:p>
+    <w:p>
+      <w:pPr>
+        <w:ind w:left="720"/>
+      </w:pPr>
+      <w:r>
+        <w:t>____________________________________________________________</w:t>
+      </w:r>
+    </w:p>
+    <w:p>
+      <w:pPr>
+        <w:pStyle w:val="Ttulo3"/>
+      </w:pPr>
+      <w:r>
+        <w:t>Semana 4 — del ___/___ al ___/___</w:t>
+      </w:r>
+    </w:p>
+    <w:p>
+      <w:pPr>
+        <w:ind w:firstLine="720"/>
+      </w:pPr>
+      <w:r>
+        <w:rPr>
+          <w:b/>
+        </w:rPr>
+        <w:t>Qué hice</w:t>
+      </w:r>
+    </w:p>
+    <w:p>
+      <w:pPr>
+        <w:tabs>
+          <w:tab w:val="left" w:pos="1077"/>
+        </w:tabs>
+        <w:ind w:left="1077" w:hanging="357"/>
+      </w:pPr>
+      <w:r>
+        <w:t>•</w:t>
+      </w:r>
+      <w:r>
+        <w:tab/>
+        <w:t xml:space="preserve">☐ Cuaderno Jupyter: correr </w:t>
+      </w:r>
+      <w:r>
+        <w:rPr>
+          <w:rFonts w:ascii="Consolas" w:hAnsi="Consolas"/>
+          <w:sz w:val="21"/>
+        </w:rPr>
+        <w:t>analysis/analisis.ipynb</w:t>
+      </w:r>
+      <w:r>
+        <w:t>, revisar tablas y gráficos</w:t>
+      </w:r>
+    </w:p>
+    <w:p>
+      <w:pPr>
+        <w:tabs>
+          <w:tab w:val="left" w:pos="1077"/>
+        </w:tabs>
+        <w:ind w:left="1077" w:hanging="357"/>
+      </w:pPr>
+      <w:r>
+        <w:t>•</w:t>
+      </w:r>
+      <w:r>
+        <w:tab/>
+        <w:t xml:space="preserve">☐ </w:t>
+      </w:r>
+      <w:r>
+        <w:rPr>
+          <w:b/>
+        </w:rPr>
+        <w:t>Paso 8:</w:t>
+      </w:r>
+      <w:r>
+        <w:t xml:space="preserve"> clonar el repositorio en una computadora que no participó y seguir solo el README; anotar cada paso que falló y cómo se corrigió</w:t>
+      </w:r>
+    </w:p>
+    <w:p>
+      <w:pPr>
+        <w:ind w:left="720"/>
+      </w:pPr>
+      <w:r>
+        <w:t>____________________________________________________________</w:t>
+      </w:r>
+    </w:p>
+    <w:p>
+      <w:pPr>
+        <w:ind w:firstLine="720"/>
+      </w:pPr>
+      <w:r>
+        <w:rPr>
+          <w:b/>
+        </w:rPr>
+        <w:lastRenderedPageBreak/>
+        <w:t>Qué aprendí</w:t>
+      </w:r>
+    </w:p>
+    <w:p>
+      <w:pPr>
+        <w:ind w:left="720"/>
+      </w:pPr>
+      <w:r>
+        <w:t>____________________________________________________________</w:t>
+      </w:r>
+    </w:p>
+    <w:p>
+      <w:pPr>
+        <w:ind w:firstLine="720"/>
+      </w:pPr>
+      <w:r>
+        <w:rPr>
+          <w:b/>
+        </w:rPr>
+        <w:t>Dificultades que encontré</w:t>
+      </w:r>
+    </w:p>
+    <w:p>
+      <w:pPr>
+        <w:ind w:left="720"/>
+      </w:pPr>
+      <w:r>
+        <w:t>____________________________________________________________</w:t>
+      </w:r>
+    </w:p>
+    <w:p>
+      <w:pPr>
+        <w:ind w:firstLine="720"/>
+      </w:pPr>
+      <w:r>
+        <w:rPr>
+          <w:b/>
+        </w:rPr>
+        <w:t>Cómo las resolví (o qué quedó pendiente)</w:t>
+      </w:r>
+    </w:p>
+    <w:p>
+      <w:pPr>
+        <w:ind w:left="720"/>
+      </w:pPr>
+      <w:r>
+        <w:t>____________________________________________________________</w:t>
+      </w:r>
+    </w:p>
+    <w:p>
+      <w:pPr>
+        <w:pStyle w:val="Ttulo3"/>
+      </w:pPr>
+      <w:r>
         <w:t>Reflexión final desde el rol</w:t>
       </w:r>
     </w:p>
@@ -31096,7 +31239,7 @@
       <w:pPr>
         <w:pStyle w:val="Ttulo1"/>
       </w:pPr>
-      <w:bookmarkStart w:id="55" w:name="_Toc243510598"/>
+      <w:bookmarkStart w:id="55" w:name="_Toc243510700"/>
       <w:r>
         <w:lastRenderedPageBreak/>
         <w:t>Anexo B: acta de roles</w:t>
@@ -32886,7 +33029,7 @@
       <w:pPr>
         <w:pStyle w:val="Ttulo1"/>
       </w:pPr>
-      <w:bookmarkStart w:id="56" w:name="_Toc243510599"/>
+      <w:bookmarkStart w:id="56" w:name="_Toc243510701"/>
       <w:r>
         <w:lastRenderedPageBreak/>
         <w:t>Anexo C: planilla de corridas</w:t>
@@ -35593,7 +35736,7 @@
       <w:pPr>
         <w:pStyle w:val="Ttulo1"/>
       </w:pPr>
-      <w:bookmarkStart w:id="57" w:name="_Toc243510600"/>
+      <w:bookmarkStart w:id="57" w:name="_Toc243510702"/>
       <w:r>
         <w:t>Anexo D: archivos de plataforma y comandos de reproducción</w:t>
       </w:r>
@@ -36304,31 +36447,31 @@
       </w:rPr>
     </w:lvl>
   </w:abstractNum>
-  <w:num w:numId="1" w16cid:durableId="1647665365">
+  <w:num w:numId="1" w16cid:durableId="2021160160">
     <w:abstractNumId w:val="8"/>
   </w:num>
-  <w:num w:numId="2" w16cid:durableId="918371798">
+  <w:num w:numId="2" w16cid:durableId="1641571826">
     <w:abstractNumId w:val="6"/>
   </w:num>
-  <w:num w:numId="3" w16cid:durableId="454912084">
+  <w:num w:numId="3" w16cid:durableId="517499201">
     <w:abstractNumId w:val="5"/>
   </w:num>
-  <w:num w:numId="4" w16cid:durableId="1779644172">
+  <w:num w:numId="4" w16cid:durableId="1697998836">
     <w:abstractNumId w:val="4"/>
   </w:num>
-  <w:num w:numId="5" w16cid:durableId="541720612">
+  <w:num w:numId="5" w16cid:durableId="728847233">
     <w:abstractNumId w:val="7"/>
   </w:num>
-  <w:num w:numId="6" w16cid:durableId="217514609">
+  <w:num w:numId="6" w16cid:durableId="1546020201">
     <w:abstractNumId w:val="3"/>
   </w:num>
-  <w:num w:numId="7" w16cid:durableId="1867674219">
+  <w:num w:numId="7" w16cid:durableId="1317345842">
     <w:abstractNumId w:val="2"/>
   </w:num>
-  <w:num w:numId="8" w16cid:durableId="2029138000">
+  <w:num w:numId="8" w16cid:durableId="1075859895">
     <w:abstractNumId w:val="1"/>
   </w:num>
-  <w:num w:numId="9" w16cid:durableId="376392496">
+  <w:num w:numId="9" w16cid:durableId="37823169">
     <w:abstractNumId w:val="0"/>
   </w:num>
 </w:numbering>
@@ -47725,7 +47868,7 @@
     <w:autoRedefine/>
     <w:uiPriority w:val="39"/>
     <w:unhideWhenUsed/>
-    <w:rsid w:val="00EF798E"/>
+    <w:rsid w:val="005C4389"/>
     <w:pPr>
       <w:spacing w:after="100"/>
     </w:pPr>
@@ -47737,7 +47880,7 @@
     <w:autoRedefine/>
     <w:uiPriority w:val="39"/>
     <w:unhideWhenUsed/>
-    <w:rsid w:val="00EF798E"/>
+    <w:rsid w:val="005C4389"/>
     <w:pPr>
       <w:spacing w:after="100"/>
       <w:ind w:left="240"/>
@@ -47748,7 +47891,7 @@
     <w:basedOn w:val="Fuentedeprrafopredeter"/>
     <w:uiPriority w:val="99"/>
     <w:unhideWhenUsed/>
-    <w:rsid w:val="00EF798E"/>
+    <w:rsid w:val="005C4389"/>
     <w:rPr>
       <w:color w:val="0000FF" w:themeColor="hyperlink"/>
       <w:u w:val="single"/>

</xml_diff>